<commit_message>
Sprint 9 - Commit 3: Modyfying Documentation
</commit_message>
<xml_diff>
--- a/docs/draft/roadmap.docx
+++ b/docs/draft/roadmap.docx
@@ -496,6 +496,7 @@
           <w:szCs w:val="32"/>
         </w:rPr>
       </w:pPr>
+      <w:proofErr w:type="spellStart"/>
       <w:r>
         <w:rPr>
           <w:sz w:val="32"/>
@@ -504,6 +505,7 @@
         </w:rPr>
         <w:t>ForecastPipeline</w:t>
       </w:r>
+      <w:proofErr w:type="spellEnd"/>
     </w:p>
     <w:p>
       <w:pPr>
@@ -14341,6 +14343,1028 @@
         </w:rPr>
         <w:t>Experiment Registry</w:t>
       </w:r>
+    </w:p>
+    <w:p>
+      <w:pPr>
+        <w:spacing w:after="0" w:line="240" w:lineRule="auto"/>
+        <w:rPr>
+          <w:b/>
+          <w:bCs/>
+          <w:noProof/>
+          <w:sz w:val="28"/>
+          <w:szCs w:val="28"/>
+        </w:rPr>
+      </w:pPr>
+    </w:p>
+    <w:p>
+      <w:pPr>
+        <w:spacing w:after="0" w:line="240" w:lineRule="auto"/>
+        <w:rPr>
+          <w:b/>
+          <w:bCs/>
+          <w:noProof/>
+          <w:sz w:val="28"/>
+          <w:szCs w:val="28"/>
+        </w:rPr>
+      </w:pPr>
+    </w:p>
+    <w:p>
+      <w:pPr>
+        <w:spacing w:after="0" w:line="240" w:lineRule="auto"/>
+        <w:rPr>
+          <w:b/>
+          <w:bCs/>
+          <w:noProof/>
+          <w:sz w:val="28"/>
+          <w:szCs w:val="28"/>
+        </w:rPr>
+      </w:pPr>
+    </w:p>
+    <w:p>
+      <w:pPr>
+        <w:rPr>
+          <w:b/>
+          <w:bCs/>
+          <w:noProof/>
+          <w:sz w:val="28"/>
+          <w:szCs w:val="28"/>
+        </w:rPr>
+      </w:pPr>
+      <w:r>
+        <w:rPr>
+          <w:b/>
+          <w:bCs/>
+          <w:noProof/>
+          <w:sz w:val="28"/>
+          <w:szCs w:val="28"/>
+        </w:rPr>
+        <w:br w:type="page"/>
+      </w:r>
+    </w:p>
+    <w:p>
+      <w:pPr>
+        <w:spacing w:after="0" w:line="240" w:lineRule="auto"/>
+        <w:rPr>
+          <w:noProof/>
+          <w:sz w:val="36"/>
+          <w:szCs w:val="36"/>
+          <w:lang w:val="tr-TR"/>
+        </w:rPr>
+      </w:pPr>
+      <w:r>
+        <w:rPr>
+          <w:b/>
+          <w:bCs/>
+          <w:noProof/>
+          <w:sz w:val="36"/>
+          <w:szCs w:val="36"/>
+          <w:lang w:val="tr-TR"/>
+        </w:rPr>
+        <w:lastRenderedPageBreak/>
+        <w:t>Sprint 9</w:t>
+      </w:r>
+      <w:r>
+        <w:rPr>
+          <w:noProof/>
+          <w:sz w:val="36"/>
+          <w:szCs w:val="36"/>
+          <w:lang w:val="tr-TR"/>
+        </w:rPr>
+        <w:t xml:space="preserve"> → LSTMForecaster </w:t>
+      </w:r>
+    </w:p>
+    <w:p>
+      <w:pPr>
+        <w:spacing w:after="0" w:line="240" w:lineRule="auto"/>
+        <w:rPr>
+          <w:noProof/>
+          <w:sz w:val="36"/>
+          <w:szCs w:val="36"/>
+          <w:lang w:val="tr-TR"/>
+        </w:rPr>
+      </w:pPr>
+      <w:r>
+        <w:rPr>
+          <w:b/>
+          <w:bCs/>
+          <w:noProof/>
+          <w:sz w:val="36"/>
+          <w:szCs w:val="36"/>
+          <w:lang w:val="tr-TR"/>
+        </w:rPr>
+        <w:t>Sprint 10</w:t>
+      </w:r>
+      <w:r>
+        <w:rPr>
+          <w:noProof/>
+          <w:sz w:val="36"/>
+          <w:szCs w:val="36"/>
+          <w:lang w:val="tr-TR"/>
+        </w:rPr>
+        <w:t xml:space="preserve"> → GRUForecaster </w:t>
+      </w:r>
+    </w:p>
+    <w:p>
+      <w:pPr>
+        <w:spacing w:after="0" w:line="240" w:lineRule="auto"/>
+        <w:rPr>
+          <w:noProof/>
+          <w:sz w:val="36"/>
+          <w:szCs w:val="36"/>
+          <w:lang w:val="tr-TR"/>
+        </w:rPr>
+      </w:pPr>
+      <w:r>
+        <w:rPr>
+          <w:b/>
+          <w:bCs/>
+          <w:noProof/>
+          <w:sz w:val="36"/>
+          <w:szCs w:val="36"/>
+          <w:lang w:val="tr-TR"/>
+        </w:rPr>
+        <w:t>Sprint 11</w:t>
+      </w:r>
+      <w:r>
+        <w:rPr>
+          <w:noProof/>
+          <w:sz w:val="36"/>
+          <w:szCs w:val="36"/>
+          <w:lang w:val="tr-TR"/>
+        </w:rPr>
+        <w:t xml:space="preserve"> → </w:t>
+      </w:r>
+      <w:r>
+        <w:rPr>
+          <w:noProof/>
+          <w:sz w:val="36"/>
+          <w:szCs w:val="36"/>
+          <w:u w:val="single"/>
+          <w:lang w:val="tr-TR"/>
+        </w:rPr>
+        <w:t>Hybrid models</w:t>
+      </w:r>
+      <w:r>
+        <w:rPr>
+          <w:noProof/>
+          <w:sz w:val="36"/>
+          <w:szCs w:val="36"/>
+          <w:u w:val="single"/>
+          <w:lang w:val="tr-TR"/>
+        </w:rPr>
+        <w:t>:</w:t>
+      </w:r>
+    </w:p>
+    <w:p>
+      <w:pPr>
+        <w:spacing w:after="0" w:line="240" w:lineRule="auto"/>
+        <w:rPr>
+          <w:noProof/>
+          <w:sz w:val="36"/>
+          <w:szCs w:val="36"/>
+          <w:lang w:val="tr-TR"/>
+        </w:rPr>
+      </w:pPr>
+      <w:r>
+        <w:rPr>
+          <w:noProof/>
+          <w:sz w:val="36"/>
+          <w:szCs w:val="36"/>
+          <w:lang w:val="tr-TR"/>
+        </w:rPr>
+        <w:t>Hyperparameter Search,</w:t>
+      </w:r>
+    </w:p>
+    <w:p>
+      <w:pPr>
+        <w:spacing w:after="0" w:line="240" w:lineRule="auto"/>
+        <w:rPr>
+          <w:noProof/>
+          <w:sz w:val="36"/>
+          <w:szCs w:val="36"/>
+          <w:lang w:val="tr-TR"/>
+        </w:rPr>
+      </w:pPr>
+      <w:r>
+        <w:rPr>
+          <w:noProof/>
+          <w:sz w:val="36"/>
+          <w:szCs w:val="36"/>
+          <w:lang w:val="tr-TR"/>
+        </w:rPr>
+        <w:t>Grid Search,</w:t>
+      </w:r>
+    </w:p>
+    <w:p>
+      <w:pPr>
+        <w:spacing w:after="0" w:line="240" w:lineRule="auto"/>
+        <w:rPr>
+          <w:noProof/>
+          <w:sz w:val="36"/>
+          <w:szCs w:val="36"/>
+          <w:lang w:val="tr-TR"/>
+        </w:rPr>
+      </w:pPr>
+      <w:r>
+        <w:rPr>
+          <w:noProof/>
+          <w:sz w:val="36"/>
+          <w:szCs w:val="36"/>
+          <w:lang w:val="tr-TR"/>
+        </w:rPr>
+        <w:t>Bayesian Search</w:t>
+      </w:r>
+      <w:r>
+        <w:rPr>
+          <w:noProof/>
+          <w:sz w:val="36"/>
+          <w:szCs w:val="36"/>
+          <w:lang w:val="tr-TR"/>
+        </w:rPr>
+        <w:t xml:space="preserve"> </w:t>
+      </w:r>
+    </w:p>
+    <w:p>
+      <w:pPr>
+        <w:spacing w:after="0" w:line="240" w:lineRule="auto"/>
+        <w:rPr>
+          <w:noProof/>
+          <w:sz w:val="24"/>
+          <w:szCs w:val="24"/>
+          <w:lang w:val="tr-TR"/>
+        </w:rPr>
+      </w:pPr>
+      <w:r>
+        <w:rPr>
+          <w:b/>
+          <w:bCs/>
+          <w:noProof/>
+          <w:sz w:val="36"/>
+          <w:szCs w:val="36"/>
+          <w:lang w:val="tr-TR"/>
+        </w:rPr>
+        <w:t>Sprint 12</w:t>
+      </w:r>
+      <w:r>
+        <w:rPr>
+          <w:noProof/>
+          <w:sz w:val="36"/>
+          <w:szCs w:val="36"/>
+          <w:lang w:val="tr-TR"/>
+        </w:rPr>
+        <w:t xml:space="preserve"> → </w:t>
+      </w:r>
+      <w:r>
+        <w:rPr>
+          <w:noProof/>
+          <w:sz w:val="24"/>
+          <w:szCs w:val="24"/>
+          <w:lang w:val="tr-TR"/>
+        </w:rPr>
+        <w:t>Dashboard</w:t>
+      </w:r>
+      <w:r>
+        <w:rPr>
+          <w:noProof/>
+          <w:sz w:val="24"/>
+          <w:szCs w:val="24"/>
+          <w:lang w:val="tr-TR"/>
+        </w:rPr>
+        <w:t>, reporting</w:t>
+      </w:r>
+      <w:r>
+        <w:rPr>
+          <w:noProof/>
+          <w:sz w:val="24"/>
+          <w:szCs w:val="24"/>
+          <w:lang w:val="tr-TR"/>
+        </w:rPr>
+        <w:t xml:space="preserve"> </w:t>
+      </w:r>
+    </w:p>
+    <w:p>
+      <w:pPr>
+        <w:spacing w:after="0" w:line="240" w:lineRule="auto"/>
+        <w:rPr>
+          <w:noProof/>
+          <w:sz w:val="36"/>
+          <w:szCs w:val="36"/>
+        </w:rPr>
+      </w:pPr>
+      <w:r>
+        <w:rPr>
+          <w:b/>
+          <w:bCs/>
+          <w:noProof/>
+          <w:sz w:val="36"/>
+          <w:szCs w:val="36"/>
+          <w:lang w:val="tr-TR"/>
+        </w:rPr>
+        <w:t>Sprint 13</w:t>
+      </w:r>
+      <w:r>
+        <w:rPr>
+          <w:noProof/>
+          <w:sz w:val="36"/>
+          <w:szCs w:val="36"/>
+          <w:lang w:val="tr-TR"/>
+        </w:rPr>
+        <w:t xml:space="preserve"> → Version 1.0</w:t>
+      </w:r>
+    </w:p>
+    <w:p>
+      <w:pPr>
+        <w:spacing w:after="0" w:line="240" w:lineRule="auto"/>
+        <w:rPr>
+          <w:b/>
+          <w:bCs/>
+          <w:noProof/>
+          <w:sz w:val="40"/>
+          <w:szCs w:val="40"/>
+          <w:u w:val="single"/>
+        </w:rPr>
+      </w:pPr>
+    </w:p>
+    <w:p>
+      <w:pPr>
+        <w:spacing w:after="0" w:line="240" w:lineRule="auto"/>
+        <w:rPr>
+          <w:b/>
+          <w:bCs/>
+          <w:noProof/>
+          <w:sz w:val="40"/>
+          <w:szCs w:val="40"/>
+          <w:u w:val="single"/>
+        </w:rPr>
+      </w:pPr>
+    </w:p>
+    <w:p>
+      <w:pPr>
+        <w:spacing w:after="0" w:line="240" w:lineRule="auto"/>
+        <w:rPr>
+          <w:b/>
+          <w:bCs/>
+          <w:noProof/>
+          <w:sz w:val="40"/>
+          <w:szCs w:val="40"/>
+          <w:u w:val="single"/>
+        </w:rPr>
+      </w:pPr>
+      <w:r>
+        <w:rPr>
+          <w:b/>
+          <w:bCs/>
+          <w:noProof/>
+          <w:sz w:val="40"/>
+          <w:szCs w:val="40"/>
+          <w:u w:val="single"/>
+        </w:rPr>
+        <w:t>Sprint 9:</w:t>
+      </w:r>
+    </w:p>
+    <w:p>
+      <w:pPr>
+        <w:spacing w:after="0" w:line="240" w:lineRule="auto"/>
+        <w:rPr>
+          <w:b/>
+          <w:bCs/>
+          <w:noProof/>
+          <w:sz w:val="28"/>
+          <w:szCs w:val="28"/>
+        </w:rPr>
+      </w:pPr>
+    </w:p>
+    <w:p>
+      <w:pPr>
+        <w:spacing w:after="0" w:line="240" w:lineRule="auto"/>
+        <w:rPr>
+          <w:b/>
+          <w:bCs/>
+          <w:noProof/>
+          <w:sz w:val="32"/>
+          <w:szCs w:val="32"/>
+        </w:rPr>
+      </w:pPr>
+      <w:r>
+        <w:rPr>
+          <w:b/>
+          <w:bCs/>
+          <w:noProof/>
+          <w:sz w:val="32"/>
+          <w:szCs w:val="32"/>
+        </w:rPr>
+        <w:t xml:space="preserve">Commit </w:t>
+      </w:r>
+      <w:r>
+        <w:rPr>
+          <w:b/>
+          <w:bCs/>
+          <w:noProof/>
+          <w:sz w:val="32"/>
+          <w:szCs w:val="32"/>
+        </w:rPr>
+        <w:t>3</w:t>
+      </w:r>
+    </w:p>
+    <w:p>
+      <w:pPr>
+        <w:spacing w:after="0" w:line="240" w:lineRule="auto"/>
+        <w:rPr>
+          <w:b/>
+          <w:bCs/>
+          <w:noProof/>
+          <w:sz w:val="32"/>
+          <w:szCs w:val="32"/>
+        </w:rPr>
+      </w:pPr>
+    </w:p>
+    <w:p>
+      <w:pPr>
+        <w:spacing w:after="0" w:line="240" w:lineRule="auto"/>
+        <w:rPr>
+          <w:b/>
+          <w:bCs/>
+          <w:noProof/>
+          <w:sz w:val="24"/>
+          <w:szCs w:val="24"/>
+        </w:rPr>
+      </w:pPr>
+      <w:r>
+        <w:rPr>
+          <w:b/>
+          <w:bCs/>
+          <w:noProof/>
+          <w:sz w:val="24"/>
+          <w:szCs w:val="24"/>
+        </w:rPr>
+        <w:t>BatteryDataset</w:t>
+      </w:r>
+    </w:p>
+    <w:p>
+      <w:pPr>
+        <w:spacing w:after="0" w:line="240" w:lineRule="auto"/>
+        <w:rPr>
+          <w:b/>
+          <w:bCs/>
+          <w:noProof/>
+          <w:sz w:val="24"/>
+          <w:szCs w:val="24"/>
+        </w:rPr>
+      </w:pPr>
+      <w:r>
+        <w:rPr>
+          <w:b/>
+          <w:bCs/>
+          <w:noProof/>
+          <w:sz w:val="24"/>
+          <w:szCs w:val="24"/>
+        </w:rPr>
+        <w:t xml:space="preserve">        │</w:t>
+      </w:r>
+    </w:p>
+    <w:p>
+      <w:pPr>
+        <w:spacing w:after="0" w:line="240" w:lineRule="auto"/>
+        <w:rPr>
+          <w:b/>
+          <w:bCs/>
+          <w:noProof/>
+          <w:sz w:val="24"/>
+          <w:szCs w:val="24"/>
+        </w:rPr>
+      </w:pPr>
+      <w:r>
+        <w:rPr>
+          <w:b/>
+          <w:bCs/>
+          <w:noProof/>
+          <w:sz w:val="24"/>
+          <w:szCs w:val="24"/>
+        </w:rPr>
+        <w:t xml:space="preserve">        </w:t>
+      </w:r>
+      <w:r>
+        <w:rPr>
+          <w:rFonts w:ascii="Arial" w:hAnsi="Arial" w:cs="Arial"/>
+          <w:b/>
+          <w:bCs/>
+          <w:noProof/>
+          <w:sz w:val="24"/>
+          <w:szCs w:val="24"/>
+        </w:rPr>
+        <w:t>▼</w:t>
+      </w:r>
+    </w:p>
+    <w:p>
+      <w:pPr>
+        <w:spacing w:after="0" w:line="240" w:lineRule="auto"/>
+        <w:rPr>
+          <w:b/>
+          <w:bCs/>
+          <w:noProof/>
+          <w:sz w:val="24"/>
+          <w:szCs w:val="24"/>
+        </w:rPr>
+      </w:pPr>
+      <w:r>
+        <w:rPr>
+          <w:b/>
+          <w:bCs/>
+          <w:noProof/>
+          <w:sz w:val="24"/>
+          <w:szCs w:val="24"/>
+        </w:rPr>
+        <w:t xml:space="preserve"> Forecaster</w:t>
+      </w:r>
+    </w:p>
+    <w:p>
+      <w:pPr>
+        <w:spacing w:after="0" w:line="240" w:lineRule="auto"/>
+        <w:rPr>
+          <w:b/>
+          <w:bCs/>
+          <w:noProof/>
+          <w:sz w:val="24"/>
+          <w:szCs w:val="24"/>
+        </w:rPr>
+      </w:pPr>
+      <w:r>
+        <w:rPr>
+          <w:b/>
+          <w:bCs/>
+          <w:noProof/>
+          <w:sz w:val="24"/>
+          <w:szCs w:val="24"/>
+        </w:rPr>
+        <w:t xml:space="preserve">        │</w:t>
+      </w:r>
+    </w:p>
+    <w:p>
+      <w:pPr>
+        <w:spacing w:after="0" w:line="240" w:lineRule="auto"/>
+        <w:rPr>
+          <w:b/>
+          <w:bCs/>
+          <w:noProof/>
+          <w:sz w:val="24"/>
+          <w:szCs w:val="24"/>
+        </w:rPr>
+      </w:pPr>
+      <w:r>
+        <w:rPr>
+          <w:b/>
+          <w:bCs/>
+          <w:noProof/>
+          <w:sz w:val="24"/>
+          <w:szCs w:val="24"/>
+        </w:rPr>
+        <w:t xml:space="preserve">        </w:t>
+      </w:r>
+      <w:r>
+        <w:rPr>
+          <w:rFonts w:ascii="Arial" w:hAnsi="Arial" w:cs="Arial"/>
+          <w:b/>
+          <w:bCs/>
+          <w:noProof/>
+          <w:sz w:val="24"/>
+          <w:szCs w:val="24"/>
+        </w:rPr>
+        <w:t>▼</w:t>
+      </w:r>
+    </w:p>
+    <w:p>
+      <w:pPr>
+        <w:spacing w:after="0" w:line="240" w:lineRule="auto"/>
+        <w:rPr>
+          <w:b/>
+          <w:bCs/>
+          <w:noProof/>
+          <w:sz w:val="24"/>
+          <w:szCs w:val="24"/>
+        </w:rPr>
+      </w:pPr>
+      <w:r>
+        <w:rPr>
+          <w:b/>
+          <w:bCs/>
+          <w:noProof/>
+          <w:sz w:val="24"/>
+          <w:szCs w:val="24"/>
+        </w:rPr>
+        <w:t xml:space="preserve"> ForecastResult</w:t>
+      </w:r>
+    </w:p>
+    <w:p>
+      <w:pPr>
+        <w:spacing w:after="0" w:line="240" w:lineRule="auto"/>
+        <w:rPr>
+          <w:b/>
+          <w:bCs/>
+          <w:noProof/>
+          <w:sz w:val="32"/>
+          <w:szCs w:val="32"/>
+        </w:rPr>
+      </w:pPr>
+    </w:p>
+    <w:p>
+      <w:pPr>
+        <w:spacing w:after="0" w:line="240" w:lineRule="auto"/>
+        <w:rPr>
+          <w:b/>
+          <w:bCs/>
+          <w:noProof/>
+          <w:sz w:val="32"/>
+          <w:szCs w:val="32"/>
+        </w:rPr>
+      </w:pPr>
+    </w:p>
+    <w:p>
+      <w:pPr>
+        <w:spacing w:after="0" w:line="240" w:lineRule="auto"/>
+        <w:rPr>
+          <w:b/>
+          <w:bCs/>
+          <w:noProof/>
+          <w:sz w:val="32"/>
+          <w:szCs w:val="32"/>
+        </w:rPr>
+      </w:pPr>
+      <w:r>
+        <w:rPr>
+          <w:b/>
+          <w:bCs/>
+          <w:noProof/>
+          <w:sz w:val="32"/>
+          <w:szCs w:val="32"/>
+        </w:rPr>
+        <w:t>Commit 4</w:t>
+      </w:r>
+    </w:p>
+    <w:p>
+      <w:pPr>
+        <w:spacing w:after="0" w:line="240" w:lineRule="auto"/>
+        <w:rPr>
+          <w:b/>
+          <w:bCs/>
+          <w:noProof/>
+          <w:sz w:val="28"/>
+          <w:szCs w:val="28"/>
+        </w:rPr>
+      </w:pPr>
+    </w:p>
+    <w:p>
+      <w:pPr>
+        <w:spacing w:after="0" w:line="240" w:lineRule="auto"/>
+        <w:rPr>
+          <w:b/>
+          <w:bCs/>
+          <w:noProof/>
+          <w:sz w:val="24"/>
+          <w:szCs w:val="24"/>
+        </w:rPr>
+      </w:pPr>
+      <w:r>
+        <w:rPr>
+          <w:b/>
+          <w:bCs/>
+          <w:noProof/>
+          <w:sz w:val="24"/>
+          <w:szCs w:val="24"/>
+        </w:rPr>
+        <w:t>BatteryDataset</w:t>
+      </w:r>
+    </w:p>
+    <w:p>
+      <w:pPr>
+        <w:spacing w:after="0" w:line="240" w:lineRule="auto"/>
+        <w:rPr>
+          <w:b/>
+          <w:bCs/>
+          <w:noProof/>
+          <w:sz w:val="24"/>
+          <w:szCs w:val="24"/>
+        </w:rPr>
+      </w:pPr>
+      <w:r>
+        <w:rPr>
+          <w:b/>
+          <w:bCs/>
+          <w:noProof/>
+          <w:sz w:val="24"/>
+          <w:szCs w:val="24"/>
+        </w:rPr>
+        <w:t xml:space="preserve">        │</w:t>
+      </w:r>
+    </w:p>
+    <w:p>
+      <w:pPr>
+        <w:spacing w:after="0" w:line="240" w:lineRule="auto"/>
+        <w:rPr>
+          <w:b/>
+          <w:bCs/>
+          <w:noProof/>
+          <w:sz w:val="24"/>
+          <w:szCs w:val="24"/>
+        </w:rPr>
+      </w:pPr>
+      <w:r>
+        <w:rPr>
+          <w:b/>
+          <w:bCs/>
+          <w:noProof/>
+          <w:sz w:val="24"/>
+          <w:szCs w:val="24"/>
+        </w:rPr>
+        <w:t xml:space="preserve">        </w:t>
+      </w:r>
+      <w:r>
+        <w:rPr>
+          <w:rFonts w:ascii="Arial" w:hAnsi="Arial" w:cs="Arial"/>
+          <w:b/>
+          <w:bCs/>
+          <w:noProof/>
+          <w:sz w:val="24"/>
+          <w:szCs w:val="24"/>
+        </w:rPr>
+        <w:t>▼</w:t>
+      </w:r>
+    </w:p>
+    <w:p>
+      <w:pPr>
+        <w:spacing w:after="0" w:line="240" w:lineRule="auto"/>
+        <w:rPr>
+          <w:b/>
+          <w:bCs/>
+          <w:noProof/>
+          <w:sz w:val="24"/>
+          <w:szCs w:val="24"/>
+        </w:rPr>
+      </w:pPr>
+      <w:r>
+        <w:rPr>
+          <w:b/>
+          <w:bCs/>
+          <w:noProof/>
+          <w:sz w:val="24"/>
+          <w:szCs w:val="24"/>
+        </w:rPr>
+        <w:t xml:space="preserve"> Forecaster</w:t>
+      </w:r>
+    </w:p>
+    <w:p>
+      <w:pPr>
+        <w:spacing w:after="0" w:line="240" w:lineRule="auto"/>
+        <w:rPr>
+          <w:b/>
+          <w:bCs/>
+          <w:noProof/>
+          <w:sz w:val="24"/>
+          <w:szCs w:val="24"/>
+        </w:rPr>
+      </w:pPr>
+      <w:r>
+        <w:rPr>
+          <w:b/>
+          <w:bCs/>
+          <w:noProof/>
+          <w:sz w:val="24"/>
+          <w:szCs w:val="24"/>
+        </w:rPr>
+        <w:t xml:space="preserve">        │</w:t>
+      </w:r>
+    </w:p>
+    <w:p>
+      <w:pPr>
+        <w:spacing w:after="0" w:line="240" w:lineRule="auto"/>
+        <w:rPr>
+          <w:b/>
+          <w:bCs/>
+          <w:noProof/>
+          <w:sz w:val="24"/>
+          <w:szCs w:val="24"/>
+        </w:rPr>
+      </w:pPr>
+      <w:r>
+        <w:rPr>
+          <w:b/>
+          <w:bCs/>
+          <w:noProof/>
+          <w:sz w:val="24"/>
+          <w:szCs w:val="24"/>
+        </w:rPr>
+        <w:t xml:space="preserve">        </w:t>
+      </w:r>
+      <w:r>
+        <w:rPr>
+          <w:rFonts w:ascii="Arial" w:hAnsi="Arial" w:cs="Arial"/>
+          <w:b/>
+          <w:bCs/>
+          <w:noProof/>
+          <w:sz w:val="24"/>
+          <w:szCs w:val="24"/>
+        </w:rPr>
+        <w:t>▼</w:t>
+      </w:r>
+    </w:p>
+    <w:p>
+      <w:pPr>
+        <w:spacing w:after="0" w:line="240" w:lineRule="auto"/>
+        <w:rPr>
+          <w:b/>
+          <w:bCs/>
+          <w:noProof/>
+          <w:sz w:val="24"/>
+          <w:szCs w:val="24"/>
+        </w:rPr>
+      </w:pPr>
+      <w:r>
+        <w:rPr>
+          <w:b/>
+          <w:bCs/>
+          <w:noProof/>
+          <w:sz w:val="24"/>
+          <w:szCs w:val="24"/>
+        </w:rPr>
+        <w:t xml:space="preserve"> ForecastResult</w:t>
+      </w:r>
+    </w:p>
+    <w:p>
+      <w:pPr>
+        <w:spacing w:after="0" w:line="240" w:lineRule="auto"/>
+        <w:rPr>
+          <w:b/>
+          <w:bCs/>
+          <w:noProof/>
+          <w:sz w:val="24"/>
+          <w:szCs w:val="24"/>
+        </w:rPr>
+      </w:pPr>
+      <w:r>
+        <w:rPr>
+          <w:b/>
+          <w:bCs/>
+          <w:noProof/>
+          <w:sz w:val="24"/>
+          <w:szCs w:val="24"/>
+        </w:rPr>
+        <w:t xml:space="preserve">        │</w:t>
+      </w:r>
+    </w:p>
+    <w:p>
+      <w:pPr>
+        <w:spacing w:after="0" w:line="240" w:lineRule="auto"/>
+        <w:rPr>
+          <w:b/>
+          <w:bCs/>
+          <w:noProof/>
+          <w:sz w:val="24"/>
+          <w:szCs w:val="24"/>
+        </w:rPr>
+      </w:pPr>
+      <w:r>
+        <w:rPr>
+          <w:b/>
+          <w:bCs/>
+          <w:noProof/>
+          <w:sz w:val="24"/>
+          <w:szCs w:val="24"/>
+        </w:rPr>
+        <w:t xml:space="preserve">        </w:t>
+      </w:r>
+      <w:r>
+        <w:rPr>
+          <w:rFonts w:ascii="Arial" w:hAnsi="Arial" w:cs="Arial"/>
+          <w:b/>
+          <w:bCs/>
+          <w:noProof/>
+          <w:sz w:val="24"/>
+          <w:szCs w:val="24"/>
+        </w:rPr>
+        <w:t>▼</w:t>
+      </w:r>
+    </w:p>
+    <w:p>
+      <w:pPr>
+        <w:spacing w:after="0" w:line="240" w:lineRule="auto"/>
+        <w:rPr>
+          <w:b/>
+          <w:bCs/>
+          <w:noProof/>
+          <w:sz w:val="24"/>
+          <w:szCs w:val="24"/>
+        </w:rPr>
+      </w:pPr>
+      <w:r>
+        <w:rPr>
+          <w:b/>
+          <w:bCs/>
+          <w:noProof/>
+          <w:sz w:val="24"/>
+          <w:szCs w:val="24"/>
+        </w:rPr>
+        <w:t xml:space="preserve"> ModelComparison</w:t>
+      </w:r>
+    </w:p>
+    <w:p>
+      <w:pPr>
+        <w:spacing w:after="0" w:line="240" w:lineRule="auto"/>
+        <w:rPr>
+          <w:b/>
+          <w:bCs/>
+          <w:noProof/>
+          <w:sz w:val="24"/>
+          <w:szCs w:val="24"/>
+        </w:rPr>
+      </w:pPr>
+      <w:r>
+        <w:rPr>
+          <w:b/>
+          <w:bCs/>
+          <w:noProof/>
+          <w:sz w:val="24"/>
+          <w:szCs w:val="24"/>
+        </w:rPr>
+        <w:t xml:space="preserve">        │</w:t>
+      </w:r>
+    </w:p>
+    <w:p>
+      <w:pPr>
+        <w:spacing w:after="0" w:line="240" w:lineRule="auto"/>
+        <w:rPr>
+          <w:b/>
+          <w:bCs/>
+          <w:noProof/>
+          <w:sz w:val="24"/>
+          <w:szCs w:val="24"/>
+        </w:rPr>
+      </w:pPr>
+      <w:r>
+        <w:rPr>
+          <w:b/>
+          <w:bCs/>
+          <w:noProof/>
+          <w:sz w:val="24"/>
+          <w:szCs w:val="24"/>
+        </w:rPr>
+        <w:t xml:space="preserve">        </w:t>
+      </w:r>
+      <w:r>
+        <w:rPr>
+          <w:rFonts w:ascii="Arial" w:hAnsi="Arial" w:cs="Arial"/>
+          <w:b/>
+          <w:bCs/>
+          <w:noProof/>
+          <w:sz w:val="24"/>
+          <w:szCs w:val="24"/>
+        </w:rPr>
+        <w:t>▼</w:t>
+      </w:r>
+    </w:p>
+    <w:p>
+      <w:pPr>
+        <w:spacing w:after="0" w:line="240" w:lineRule="auto"/>
+        <w:rPr>
+          <w:b/>
+          <w:bCs/>
+          <w:noProof/>
+          <w:sz w:val="24"/>
+          <w:szCs w:val="24"/>
+        </w:rPr>
+      </w:pPr>
+      <w:r>
+        <w:rPr>
+          <w:b/>
+          <w:bCs/>
+          <w:noProof/>
+          <w:sz w:val="24"/>
+          <w:szCs w:val="24"/>
+        </w:rPr>
+        <w:t xml:space="preserve"> Benchmark Report</w:t>
+      </w:r>
+    </w:p>
+    <w:p>
+      <w:pPr>
+        <w:spacing w:after="0" w:line="240" w:lineRule="auto"/>
+        <w:rPr>
+          <w:b/>
+          <w:bCs/>
+          <w:noProof/>
+          <w:sz w:val="24"/>
+          <w:szCs w:val="24"/>
+        </w:rPr>
+      </w:pPr>
+    </w:p>
+    <w:p>
+      <w:pPr>
+        <w:spacing w:after="0" w:line="240" w:lineRule="auto"/>
+        <w:rPr>
+          <w:b/>
+          <w:bCs/>
+          <w:noProof/>
+          <w:sz w:val="24"/>
+          <w:szCs w:val="24"/>
+        </w:rPr>
+      </w:pPr>
     </w:p>
     <w:sectPr>
       <w:pgSz w:w="11906" w:h="16838"/>
@@ -17849,7 +18873,6 @@
   <w:style w:type="character" w:default="1" w:styleId="VarsaylanParagrafYazTipi">
     <w:name w:val="Default Paragraph Font"/>
     <w:uiPriority w:val="1"/>
-    <w:semiHidden/>
     <w:unhideWhenUsed/>
   </w:style>
   <w:style w:type="table" w:default="1" w:styleId="NormalTablo">

</xml_diff>

<commit_message>
Sprint 9 - Commit 6 : First working Kalman-LSTM hybrid forecasting framework
</commit_message>
<xml_diff>
--- a/docs/draft/roadmap.docx
+++ b/docs/draft/roadmap.docx
@@ -17911,9 +17911,577 @@
           <w:szCs w:val="32"/>
           <w:u w:val="single"/>
         </w:rPr>
-        <w:t>KalmanLSTMForecaster</w:t>
-      </w:r>
-      <w:r>
+        <w:t>KalmanLSTMForecaster:</w:t>
+      </w:r>
+    </w:p>
+    <w:p>
+      <w:pPr>
+        <w:spacing w:after="0" w:line="240" w:lineRule="auto"/>
+        <w:rPr>
+          <w:noProof/>
+          <w:sz w:val="24"/>
+          <w:szCs w:val="24"/>
+        </w:rPr>
+      </w:pPr>
+    </w:p>
+    <w:p>
+      <w:pPr>
+        <w:spacing w:after="0" w:line="240" w:lineRule="auto"/>
+        <w:rPr>
+          <w:noProof/>
+          <w:sz w:val="24"/>
+          <w:szCs w:val="24"/>
+        </w:rPr>
+      </w:pPr>
+      <w:r>
+        <w:rPr>
+          <w:noProof/>
+          <w:sz w:val="24"/>
+          <w:szCs w:val="24"/>
+        </w:rPr>
+        <w:t>Measured signal</w:t>
+      </w:r>
+    </w:p>
+    <w:p>
+      <w:pPr>
+        <w:spacing w:after="0" w:line="240" w:lineRule="auto"/>
+        <w:rPr>
+          <w:noProof/>
+          <w:sz w:val="24"/>
+          <w:szCs w:val="24"/>
+        </w:rPr>
+      </w:pPr>
+      <w:r>
+        <w:rPr>
+          <w:noProof/>
+          <w:sz w:val="24"/>
+          <w:szCs w:val="24"/>
+        </w:rPr>
+        <w:t xml:space="preserve">        </w:t>
+      </w:r>
+      <w:r>
+        <w:rPr>
+          <w:noProof/>
+          <w:sz w:val="24"/>
+          <w:szCs w:val="24"/>
+        </w:rPr>
+        <w:t xml:space="preserve"> </w:t>
+      </w:r>
+      <w:r>
+        <w:rPr>
+          <w:noProof/>
+          <w:sz w:val="24"/>
+          <w:szCs w:val="24"/>
+        </w:rPr>
+        <w:t>│</w:t>
+      </w:r>
+    </w:p>
+    <w:p>
+      <w:pPr>
+        <w:spacing w:after="0" w:line="240" w:lineRule="auto"/>
+        <w:rPr>
+          <w:noProof/>
+          <w:sz w:val="24"/>
+          <w:szCs w:val="24"/>
+        </w:rPr>
+      </w:pPr>
+      <w:r>
+        <w:rPr>
+          <w:noProof/>
+          <w:sz w:val="24"/>
+          <w:szCs w:val="24"/>
+        </w:rPr>
+        <w:t xml:space="preserve">        </w:t>
+      </w:r>
+      <w:r>
+        <w:rPr>
+          <w:rFonts w:ascii="Arial" w:hAnsi="Arial" w:cs="Arial"/>
+          <w:noProof/>
+          <w:sz w:val="24"/>
+          <w:szCs w:val="24"/>
+        </w:rPr>
+        <w:t>▼</w:t>
+      </w:r>
+    </w:p>
+    <w:p>
+      <w:pPr>
+        <w:spacing w:after="0" w:line="240" w:lineRule="auto"/>
+        <w:rPr>
+          <w:noProof/>
+          <w:sz w:val="24"/>
+          <w:szCs w:val="24"/>
+        </w:rPr>
+      </w:pPr>
+      <w:r>
+        <w:rPr>
+          <w:noProof/>
+          <w:sz w:val="24"/>
+          <w:szCs w:val="24"/>
+        </w:rPr>
+        <w:t>Adaptive Kalman Filter</w:t>
+      </w:r>
+    </w:p>
+    <w:p>
+      <w:pPr>
+        <w:spacing w:after="0" w:line="240" w:lineRule="auto"/>
+        <w:rPr>
+          <w:noProof/>
+          <w:sz w:val="24"/>
+          <w:szCs w:val="24"/>
+        </w:rPr>
+      </w:pPr>
+      <w:r>
+        <w:rPr>
+          <w:noProof/>
+          <w:sz w:val="24"/>
+          <w:szCs w:val="24"/>
+        </w:rPr>
+        <w:t xml:space="preserve">        </w:t>
+      </w:r>
+      <w:r>
+        <w:rPr>
+          <w:noProof/>
+          <w:sz w:val="24"/>
+          <w:szCs w:val="24"/>
+        </w:rPr>
+        <w:t xml:space="preserve"> </w:t>
+      </w:r>
+      <w:r>
+        <w:rPr>
+          <w:noProof/>
+          <w:sz w:val="24"/>
+          <w:szCs w:val="24"/>
+        </w:rPr>
+        <w:t>│</w:t>
+      </w:r>
+    </w:p>
+    <w:p>
+      <w:pPr>
+        <w:spacing w:after="0" w:line="240" w:lineRule="auto"/>
+        <w:rPr>
+          <w:noProof/>
+          <w:sz w:val="24"/>
+          <w:szCs w:val="24"/>
+        </w:rPr>
+      </w:pPr>
+      <w:r>
+        <w:rPr>
+          <w:noProof/>
+          <w:sz w:val="24"/>
+          <w:szCs w:val="24"/>
+        </w:rPr>
+        <w:t>Trend estimate</w:t>
+      </w:r>
+    </w:p>
+    <w:p>
+      <w:pPr>
+        <w:spacing w:after="0" w:line="240" w:lineRule="auto"/>
+        <w:rPr>
+          <w:noProof/>
+          <w:sz w:val="24"/>
+          <w:szCs w:val="24"/>
+        </w:rPr>
+      </w:pPr>
+      <w:r>
+        <w:rPr>
+          <w:noProof/>
+          <w:sz w:val="24"/>
+          <w:szCs w:val="24"/>
+        </w:rPr>
+        <w:t xml:space="preserve">        </w:t>
+      </w:r>
+      <w:r>
+        <w:rPr>
+          <w:noProof/>
+          <w:sz w:val="24"/>
+          <w:szCs w:val="24"/>
+        </w:rPr>
+        <w:t xml:space="preserve"> </w:t>
+      </w:r>
+      <w:r>
+        <w:rPr>
+          <w:noProof/>
+          <w:sz w:val="24"/>
+          <w:szCs w:val="24"/>
+        </w:rPr>
+        <w:t>│</w:t>
+      </w:r>
+    </w:p>
+    <w:p>
+      <w:pPr>
+        <w:spacing w:after="0" w:line="240" w:lineRule="auto"/>
+        <w:rPr>
+          <w:noProof/>
+          <w:sz w:val="24"/>
+          <w:szCs w:val="24"/>
+        </w:rPr>
+      </w:pPr>
+      <w:r>
+        <w:rPr>
+          <w:noProof/>
+          <w:sz w:val="24"/>
+          <w:szCs w:val="24"/>
+        </w:rPr>
+        <w:t xml:space="preserve">        </w:t>
+      </w:r>
+      <w:r>
+        <w:rPr>
+          <w:rFonts w:ascii="Arial" w:hAnsi="Arial" w:cs="Arial"/>
+          <w:noProof/>
+          <w:sz w:val="24"/>
+          <w:szCs w:val="24"/>
+        </w:rPr>
+        <w:t>▼</w:t>
+      </w:r>
+    </w:p>
+    <w:p>
+      <w:pPr>
+        <w:spacing w:after="0" w:line="240" w:lineRule="auto"/>
+        <w:rPr>
+          <w:noProof/>
+          <w:sz w:val="24"/>
+          <w:szCs w:val="24"/>
+        </w:rPr>
+      </w:pPr>
+      <w:r>
+        <w:rPr>
+          <w:noProof/>
+          <w:sz w:val="24"/>
+          <w:szCs w:val="24"/>
+        </w:rPr>
+        <w:t>Residual signal</w:t>
+      </w:r>
+    </w:p>
+    <w:p>
+      <w:pPr>
+        <w:spacing w:after="0" w:line="240" w:lineRule="auto"/>
+        <w:rPr>
+          <w:noProof/>
+          <w:sz w:val="24"/>
+          <w:szCs w:val="24"/>
+        </w:rPr>
+      </w:pPr>
+      <w:r>
+        <w:rPr>
+          <w:noProof/>
+          <w:sz w:val="24"/>
+          <w:szCs w:val="24"/>
+        </w:rPr>
+        <w:t xml:space="preserve">        </w:t>
+      </w:r>
+      <w:r>
+        <w:rPr>
+          <w:noProof/>
+          <w:sz w:val="24"/>
+          <w:szCs w:val="24"/>
+        </w:rPr>
+        <w:t xml:space="preserve"> </w:t>
+      </w:r>
+      <w:r>
+        <w:rPr>
+          <w:noProof/>
+          <w:sz w:val="24"/>
+          <w:szCs w:val="24"/>
+        </w:rPr>
+        <w:t>│</w:t>
+      </w:r>
+    </w:p>
+    <w:p>
+      <w:pPr>
+        <w:spacing w:after="0" w:line="240" w:lineRule="auto"/>
+        <w:rPr>
+          <w:noProof/>
+          <w:sz w:val="24"/>
+          <w:szCs w:val="24"/>
+        </w:rPr>
+      </w:pPr>
+      <w:r>
+        <w:rPr>
+          <w:noProof/>
+          <w:sz w:val="24"/>
+          <w:szCs w:val="24"/>
+        </w:rPr>
+        <w:t xml:space="preserve">        </w:t>
+      </w:r>
+      <w:r>
+        <w:rPr>
+          <w:rFonts w:ascii="Arial" w:hAnsi="Arial" w:cs="Arial"/>
+          <w:noProof/>
+          <w:sz w:val="24"/>
+          <w:szCs w:val="24"/>
+        </w:rPr>
+        <w:t>▼</w:t>
+      </w:r>
+    </w:p>
+    <w:p>
+      <w:pPr>
+        <w:spacing w:after="0" w:line="240" w:lineRule="auto"/>
+        <w:rPr>
+          <w:noProof/>
+          <w:sz w:val="24"/>
+          <w:szCs w:val="24"/>
+        </w:rPr>
+      </w:pPr>
+      <w:r>
+        <w:rPr>
+          <w:noProof/>
+          <w:sz w:val="24"/>
+          <w:szCs w:val="24"/>
+        </w:rPr>
+        <w:t xml:space="preserve">     </w:t>
+      </w:r>
+      <w:r>
+        <w:rPr>
+          <w:noProof/>
+          <w:sz w:val="24"/>
+          <w:szCs w:val="24"/>
+        </w:rPr>
+        <w:t>LSTM</w:t>
+      </w:r>
+    </w:p>
+    <w:p>
+      <w:pPr>
+        <w:spacing w:after="0" w:line="240" w:lineRule="auto"/>
+        <w:rPr>
+          <w:noProof/>
+          <w:sz w:val="24"/>
+          <w:szCs w:val="24"/>
+        </w:rPr>
+      </w:pPr>
+      <w:r>
+        <w:rPr>
+          <w:noProof/>
+          <w:sz w:val="24"/>
+          <w:szCs w:val="24"/>
+        </w:rPr>
+        <w:t xml:space="preserve">        </w:t>
+      </w:r>
+      <w:r>
+        <w:rPr>
+          <w:noProof/>
+          <w:sz w:val="24"/>
+          <w:szCs w:val="24"/>
+        </w:rPr>
+        <w:t xml:space="preserve"> </w:t>
+      </w:r>
+      <w:r>
+        <w:rPr>
+          <w:noProof/>
+          <w:sz w:val="24"/>
+          <w:szCs w:val="24"/>
+        </w:rPr>
+        <w:t>│</w:t>
+      </w:r>
+    </w:p>
+    <w:p>
+      <w:pPr>
+        <w:spacing w:after="0" w:line="240" w:lineRule="auto"/>
+        <w:rPr>
+          <w:noProof/>
+          <w:sz w:val="24"/>
+          <w:szCs w:val="24"/>
+        </w:rPr>
+      </w:pPr>
+      <w:r>
+        <w:rPr>
+          <w:noProof/>
+          <w:sz w:val="24"/>
+          <w:szCs w:val="24"/>
+        </w:rPr>
+        <w:t>Residual forecast</w:t>
+      </w:r>
+    </w:p>
+    <w:p>
+      <w:pPr>
+        <w:spacing w:after="0" w:line="240" w:lineRule="auto"/>
+        <w:rPr>
+          <w:noProof/>
+          <w:sz w:val="24"/>
+          <w:szCs w:val="24"/>
+        </w:rPr>
+      </w:pPr>
+      <w:r>
+        <w:rPr>
+          <w:noProof/>
+          <w:sz w:val="24"/>
+          <w:szCs w:val="24"/>
+        </w:rPr>
+        <w:t xml:space="preserve">        </w:t>
+      </w:r>
+      <w:r>
+        <w:rPr>
+          <w:noProof/>
+          <w:sz w:val="24"/>
+          <w:szCs w:val="24"/>
+        </w:rPr>
+        <w:t xml:space="preserve"> </w:t>
+      </w:r>
+      <w:r>
+        <w:rPr>
+          <w:noProof/>
+          <w:sz w:val="24"/>
+          <w:szCs w:val="24"/>
+        </w:rPr>
+        <w:t>│</w:t>
+      </w:r>
+    </w:p>
+    <w:p>
+      <w:pPr>
+        <w:spacing w:after="0" w:line="240" w:lineRule="auto"/>
+        <w:rPr>
+          <w:noProof/>
+          <w:sz w:val="24"/>
+          <w:szCs w:val="24"/>
+        </w:rPr>
+      </w:pPr>
+      <w:r>
+        <w:rPr>
+          <w:noProof/>
+          <w:sz w:val="24"/>
+          <w:szCs w:val="24"/>
+        </w:rPr>
+        <w:t xml:space="preserve">        </w:t>
+      </w:r>
+      <w:r>
+        <w:rPr>
+          <w:rFonts w:ascii="Arial" w:hAnsi="Arial" w:cs="Arial"/>
+          <w:noProof/>
+          <w:sz w:val="24"/>
+          <w:szCs w:val="24"/>
+        </w:rPr>
+        <w:t>▼</w:t>
+      </w:r>
+    </w:p>
+    <w:p>
+      <w:pPr>
+        <w:spacing w:after="0" w:line="240" w:lineRule="auto"/>
+        <w:rPr>
+          <w:noProof/>
+          <w:sz w:val="24"/>
+          <w:szCs w:val="24"/>
+        </w:rPr>
+      </w:pPr>
+      <w:r>
+        <w:rPr>
+          <w:noProof/>
+          <w:sz w:val="24"/>
+          <w:szCs w:val="24"/>
+        </w:rPr>
+        <w:t>Kalman trend forecast</w:t>
+      </w:r>
+    </w:p>
+    <w:p>
+      <w:pPr>
+        <w:spacing w:after="0" w:line="240" w:lineRule="auto"/>
+        <w:rPr>
+          <w:noProof/>
+          <w:sz w:val="24"/>
+          <w:szCs w:val="24"/>
+        </w:rPr>
+      </w:pPr>
+      <w:r>
+        <w:rPr>
+          <w:noProof/>
+          <w:sz w:val="24"/>
+          <w:szCs w:val="24"/>
+        </w:rPr>
+        <w:t xml:space="preserve">        </w:t>
+      </w:r>
+      <w:r>
+        <w:rPr>
+          <w:noProof/>
+          <w:sz w:val="24"/>
+          <w:szCs w:val="24"/>
+        </w:rPr>
+        <w:t xml:space="preserve"> </w:t>
+      </w:r>
+      <w:r>
+        <w:rPr>
+          <w:noProof/>
+          <w:sz w:val="24"/>
+          <w:szCs w:val="24"/>
+        </w:rPr>
+        <w:t>│</w:t>
+      </w:r>
+    </w:p>
+    <w:p>
+      <w:pPr>
+        <w:spacing w:after="0" w:line="240" w:lineRule="auto"/>
+        <w:rPr>
+          <w:noProof/>
+          <w:sz w:val="24"/>
+          <w:szCs w:val="24"/>
+        </w:rPr>
+      </w:pPr>
+      <w:r>
+        <w:rPr>
+          <w:noProof/>
+          <w:sz w:val="24"/>
+          <w:szCs w:val="24"/>
+        </w:rPr>
+        <w:t xml:space="preserve">        </w:t>
+      </w:r>
+      <w:r>
+        <w:rPr>
+          <w:rFonts w:ascii="Arial" w:hAnsi="Arial" w:cs="Arial"/>
+          <w:noProof/>
+          <w:sz w:val="24"/>
+          <w:szCs w:val="24"/>
+        </w:rPr>
+        <w:t>▼</w:t>
+      </w:r>
+    </w:p>
+    <w:p>
+      <w:pPr>
+        <w:spacing w:after="0" w:line="240" w:lineRule="auto"/>
+        <w:rPr>
+          <w:noProof/>
+          <w:sz w:val="24"/>
+          <w:szCs w:val="24"/>
+        </w:rPr>
+      </w:pPr>
+      <w:r>
+        <w:rPr>
+          <w:noProof/>
+          <w:sz w:val="24"/>
+          <w:szCs w:val="24"/>
+        </w:rPr>
+        <w:t>Final forecast</w:t>
+      </w:r>
+    </w:p>
+    <w:p>
+      <w:pPr>
+        <w:spacing w:after="0" w:line="240" w:lineRule="auto"/>
+        <w:rPr>
+          <w:noProof/>
+          <w:sz w:val="24"/>
+          <w:szCs w:val="24"/>
+        </w:rPr>
+      </w:pPr>
+    </w:p>
+    <w:p>
+      <w:pPr>
+        <w:spacing w:after="0" w:line="240" w:lineRule="auto"/>
+        <w:rPr>
+          <w:noProof/>
+          <w:sz w:val="24"/>
+          <w:szCs w:val="24"/>
+        </w:rPr>
+      </w:pPr>
+    </w:p>
+    <w:p>
+      <w:pPr>
+        <w:spacing w:after="0" w:line="240" w:lineRule="auto"/>
+        <w:rPr>
+          <w:noProof/>
+          <w:sz w:val="24"/>
+          <w:szCs w:val="24"/>
+        </w:rPr>
+      </w:pPr>
+    </w:p>
+    <w:p>
+      <w:pPr>
+        <w:spacing w:after="0" w:line="240" w:lineRule="auto"/>
         <w:rPr>
           <w:b/>
           <w:bCs/>
@@ -17921,578 +18489,10 @@
           <w:sz w:val="32"/>
           <w:szCs w:val="32"/>
           <w:u w:val="single"/>
-        </w:rPr>
-        <w:t>:</w:t>
-      </w:r>
-    </w:p>
-    <w:p>
-      <w:pPr>
-        <w:spacing w:after="0" w:line="240" w:lineRule="auto"/>
-        <w:rPr>
-          <w:noProof/>
-          <w:sz w:val="24"/>
-          <w:szCs w:val="24"/>
-        </w:rPr>
-      </w:pPr>
-    </w:p>
-    <w:p>
-      <w:pPr>
-        <w:spacing w:after="0" w:line="240" w:lineRule="auto"/>
-        <w:rPr>
-          <w:noProof/>
-          <w:sz w:val="24"/>
-          <w:szCs w:val="24"/>
-        </w:rPr>
-      </w:pPr>
-      <w:r>
-        <w:rPr>
-          <w:noProof/>
-          <w:sz w:val="24"/>
-          <w:szCs w:val="24"/>
-        </w:rPr>
-        <w:t>Measured signal</w:t>
-      </w:r>
-    </w:p>
-    <w:p>
-      <w:pPr>
-        <w:spacing w:after="0" w:line="240" w:lineRule="auto"/>
-        <w:rPr>
-          <w:noProof/>
-          <w:sz w:val="24"/>
-          <w:szCs w:val="24"/>
-        </w:rPr>
-      </w:pPr>
-      <w:r>
-        <w:rPr>
-          <w:noProof/>
-          <w:sz w:val="24"/>
-          <w:szCs w:val="24"/>
-        </w:rPr>
-        <w:t xml:space="preserve">        </w:t>
-      </w:r>
-      <w:r>
-        <w:rPr>
-          <w:noProof/>
-          <w:sz w:val="24"/>
-          <w:szCs w:val="24"/>
-        </w:rPr>
-        <w:t xml:space="preserve"> </w:t>
-      </w:r>
-      <w:r>
-        <w:rPr>
-          <w:noProof/>
-          <w:sz w:val="24"/>
-          <w:szCs w:val="24"/>
-        </w:rPr>
-        <w:t>│</w:t>
-      </w:r>
-    </w:p>
-    <w:p>
-      <w:pPr>
-        <w:spacing w:after="0" w:line="240" w:lineRule="auto"/>
-        <w:rPr>
-          <w:noProof/>
-          <w:sz w:val="24"/>
-          <w:szCs w:val="24"/>
-        </w:rPr>
-      </w:pPr>
-      <w:r>
-        <w:rPr>
-          <w:noProof/>
-          <w:sz w:val="24"/>
-          <w:szCs w:val="24"/>
-        </w:rPr>
-        <w:t xml:space="preserve">        </w:t>
-      </w:r>
-      <w:r>
-        <w:rPr>
-          <w:rFonts w:ascii="Arial" w:hAnsi="Arial" w:cs="Arial"/>
-          <w:noProof/>
-          <w:sz w:val="24"/>
-          <w:szCs w:val="24"/>
-        </w:rPr>
-        <w:t>▼</w:t>
-      </w:r>
-    </w:p>
-    <w:p>
-      <w:pPr>
-        <w:spacing w:after="0" w:line="240" w:lineRule="auto"/>
-        <w:rPr>
-          <w:noProof/>
-          <w:sz w:val="24"/>
-          <w:szCs w:val="24"/>
-        </w:rPr>
-      </w:pPr>
-      <w:r>
-        <w:rPr>
-          <w:noProof/>
-          <w:sz w:val="24"/>
-          <w:szCs w:val="24"/>
-        </w:rPr>
-        <w:t>Adaptive Kalman Filter</w:t>
-      </w:r>
-    </w:p>
-    <w:p>
-      <w:pPr>
-        <w:spacing w:after="0" w:line="240" w:lineRule="auto"/>
-        <w:rPr>
-          <w:noProof/>
-          <w:sz w:val="24"/>
-          <w:szCs w:val="24"/>
-        </w:rPr>
-      </w:pPr>
-      <w:r>
-        <w:rPr>
-          <w:noProof/>
-          <w:sz w:val="24"/>
-          <w:szCs w:val="24"/>
-        </w:rPr>
-        <w:t xml:space="preserve">        </w:t>
-      </w:r>
-      <w:r>
-        <w:rPr>
-          <w:noProof/>
-          <w:sz w:val="24"/>
-          <w:szCs w:val="24"/>
-        </w:rPr>
-        <w:t xml:space="preserve"> </w:t>
-      </w:r>
-      <w:r>
-        <w:rPr>
-          <w:noProof/>
-          <w:sz w:val="24"/>
-          <w:szCs w:val="24"/>
-        </w:rPr>
-        <w:t>│</w:t>
-      </w:r>
-    </w:p>
-    <w:p>
-      <w:pPr>
-        <w:spacing w:after="0" w:line="240" w:lineRule="auto"/>
-        <w:rPr>
-          <w:noProof/>
-          <w:sz w:val="24"/>
-          <w:szCs w:val="24"/>
-        </w:rPr>
-      </w:pPr>
-      <w:r>
-        <w:rPr>
-          <w:noProof/>
-          <w:sz w:val="24"/>
-          <w:szCs w:val="24"/>
-        </w:rPr>
-        <w:t>Trend estimate</w:t>
-      </w:r>
-    </w:p>
-    <w:p>
-      <w:pPr>
-        <w:spacing w:after="0" w:line="240" w:lineRule="auto"/>
-        <w:rPr>
-          <w:noProof/>
-          <w:sz w:val="24"/>
-          <w:szCs w:val="24"/>
-        </w:rPr>
-      </w:pPr>
-      <w:r>
-        <w:rPr>
-          <w:noProof/>
-          <w:sz w:val="24"/>
-          <w:szCs w:val="24"/>
-        </w:rPr>
-        <w:t xml:space="preserve">        </w:t>
-      </w:r>
-      <w:r>
-        <w:rPr>
-          <w:noProof/>
-          <w:sz w:val="24"/>
-          <w:szCs w:val="24"/>
-        </w:rPr>
-        <w:t xml:space="preserve"> </w:t>
-      </w:r>
-      <w:r>
-        <w:rPr>
-          <w:noProof/>
-          <w:sz w:val="24"/>
-          <w:szCs w:val="24"/>
-        </w:rPr>
-        <w:t>│</w:t>
-      </w:r>
-    </w:p>
-    <w:p>
-      <w:pPr>
-        <w:spacing w:after="0" w:line="240" w:lineRule="auto"/>
-        <w:rPr>
-          <w:noProof/>
-          <w:sz w:val="24"/>
-          <w:szCs w:val="24"/>
-        </w:rPr>
-      </w:pPr>
-      <w:r>
-        <w:rPr>
-          <w:noProof/>
-          <w:sz w:val="24"/>
-          <w:szCs w:val="24"/>
-        </w:rPr>
-        <w:t xml:space="preserve">        </w:t>
-      </w:r>
-      <w:r>
-        <w:rPr>
-          <w:rFonts w:ascii="Arial" w:hAnsi="Arial" w:cs="Arial"/>
-          <w:noProof/>
-          <w:sz w:val="24"/>
-          <w:szCs w:val="24"/>
-        </w:rPr>
-        <w:t>▼</w:t>
-      </w:r>
-    </w:p>
-    <w:p>
-      <w:pPr>
-        <w:spacing w:after="0" w:line="240" w:lineRule="auto"/>
-        <w:rPr>
-          <w:noProof/>
-          <w:sz w:val="24"/>
-          <w:szCs w:val="24"/>
-        </w:rPr>
-      </w:pPr>
-      <w:r>
-        <w:rPr>
-          <w:noProof/>
-          <w:sz w:val="24"/>
-          <w:szCs w:val="24"/>
-        </w:rPr>
-        <w:t>Residual signal</w:t>
-      </w:r>
-    </w:p>
-    <w:p>
-      <w:pPr>
-        <w:spacing w:after="0" w:line="240" w:lineRule="auto"/>
-        <w:rPr>
-          <w:noProof/>
-          <w:sz w:val="24"/>
-          <w:szCs w:val="24"/>
-        </w:rPr>
-      </w:pPr>
-      <w:r>
-        <w:rPr>
-          <w:noProof/>
-          <w:sz w:val="24"/>
-          <w:szCs w:val="24"/>
-        </w:rPr>
-        <w:t xml:space="preserve">        </w:t>
-      </w:r>
-      <w:r>
-        <w:rPr>
-          <w:noProof/>
-          <w:sz w:val="24"/>
-          <w:szCs w:val="24"/>
-        </w:rPr>
-        <w:t xml:space="preserve"> </w:t>
-      </w:r>
-      <w:r>
-        <w:rPr>
-          <w:noProof/>
-          <w:sz w:val="24"/>
-          <w:szCs w:val="24"/>
-        </w:rPr>
-        <w:t>│</w:t>
-      </w:r>
-    </w:p>
-    <w:p>
-      <w:pPr>
-        <w:spacing w:after="0" w:line="240" w:lineRule="auto"/>
-        <w:rPr>
-          <w:noProof/>
-          <w:sz w:val="24"/>
-          <w:szCs w:val="24"/>
-        </w:rPr>
-      </w:pPr>
-      <w:r>
-        <w:rPr>
-          <w:noProof/>
-          <w:sz w:val="24"/>
-          <w:szCs w:val="24"/>
-        </w:rPr>
-        <w:t xml:space="preserve">        </w:t>
-      </w:r>
-      <w:r>
-        <w:rPr>
-          <w:rFonts w:ascii="Arial" w:hAnsi="Arial" w:cs="Arial"/>
-          <w:noProof/>
-          <w:sz w:val="24"/>
-          <w:szCs w:val="24"/>
-        </w:rPr>
-        <w:t>▼</w:t>
-      </w:r>
-    </w:p>
-    <w:p>
-      <w:pPr>
-        <w:spacing w:after="0" w:line="240" w:lineRule="auto"/>
-        <w:rPr>
-          <w:noProof/>
-          <w:sz w:val="24"/>
-          <w:szCs w:val="24"/>
-        </w:rPr>
-      </w:pPr>
-      <w:r>
-        <w:rPr>
-          <w:noProof/>
-          <w:sz w:val="24"/>
-          <w:szCs w:val="24"/>
-        </w:rPr>
-        <w:t xml:space="preserve">     </w:t>
-      </w:r>
-      <w:r>
-        <w:rPr>
-          <w:noProof/>
-          <w:sz w:val="24"/>
-          <w:szCs w:val="24"/>
-        </w:rPr>
-        <w:t>LSTM</w:t>
-      </w:r>
-    </w:p>
-    <w:p>
-      <w:pPr>
-        <w:spacing w:after="0" w:line="240" w:lineRule="auto"/>
-        <w:rPr>
-          <w:noProof/>
-          <w:sz w:val="24"/>
-          <w:szCs w:val="24"/>
-        </w:rPr>
-      </w:pPr>
-      <w:r>
-        <w:rPr>
-          <w:noProof/>
-          <w:sz w:val="24"/>
-          <w:szCs w:val="24"/>
-        </w:rPr>
-        <w:t xml:space="preserve">        </w:t>
-      </w:r>
-      <w:r>
-        <w:rPr>
-          <w:noProof/>
-          <w:sz w:val="24"/>
-          <w:szCs w:val="24"/>
-        </w:rPr>
-        <w:t xml:space="preserve"> </w:t>
-      </w:r>
-      <w:r>
-        <w:rPr>
-          <w:noProof/>
-          <w:sz w:val="24"/>
-          <w:szCs w:val="24"/>
-        </w:rPr>
-        <w:t>│</w:t>
-      </w:r>
-    </w:p>
-    <w:p>
-      <w:pPr>
-        <w:spacing w:after="0" w:line="240" w:lineRule="auto"/>
-        <w:rPr>
-          <w:noProof/>
-          <w:sz w:val="24"/>
-          <w:szCs w:val="24"/>
-        </w:rPr>
-      </w:pPr>
-      <w:r>
-        <w:rPr>
-          <w:noProof/>
-          <w:sz w:val="24"/>
-          <w:szCs w:val="24"/>
-        </w:rPr>
-        <w:t>Residual forecast</w:t>
-      </w:r>
-    </w:p>
-    <w:p>
-      <w:pPr>
-        <w:spacing w:after="0" w:line="240" w:lineRule="auto"/>
-        <w:rPr>
-          <w:noProof/>
-          <w:sz w:val="24"/>
-          <w:szCs w:val="24"/>
-        </w:rPr>
-      </w:pPr>
-      <w:r>
-        <w:rPr>
-          <w:noProof/>
-          <w:sz w:val="24"/>
-          <w:szCs w:val="24"/>
-        </w:rPr>
-        <w:t xml:space="preserve">        </w:t>
-      </w:r>
-      <w:r>
-        <w:rPr>
-          <w:noProof/>
-          <w:sz w:val="24"/>
-          <w:szCs w:val="24"/>
-        </w:rPr>
-        <w:t xml:space="preserve"> </w:t>
-      </w:r>
-      <w:r>
-        <w:rPr>
-          <w:noProof/>
-          <w:sz w:val="24"/>
-          <w:szCs w:val="24"/>
-        </w:rPr>
-        <w:t>│</w:t>
-      </w:r>
-    </w:p>
-    <w:p>
-      <w:pPr>
-        <w:spacing w:after="0" w:line="240" w:lineRule="auto"/>
-        <w:rPr>
-          <w:noProof/>
-          <w:sz w:val="24"/>
-          <w:szCs w:val="24"/>
-        </w:rPr>
-      </w:pPr>
-      <w:r>
-        <w:rPr>
-          <w:noProof/>
-          <w:sz w:val="24"/>
-          <w:szCs w:val="24"/>
-        </w:rPr>
-        <w:t xml:space="preserve">        </w:t>
-      </w:r>
-      <w:r>
-        <w:rPr>
-          <w:rFonts w:ascii="Arial" w:hAnsi="Arial" w:cs="Arial"/>
-          <w:noProof/>
-          <w:sz w:val="24"/>
-          <w:szCs w:val="24"/>
-        </w:rPr>
-        <w:t>▼</w:t>
-      </w:r>
-    </w:p>
-    <w:p>
-      <w:pPr>
-        <w:spacing w:after="0" w:line="240" w:lineRule="auto"/>
-        <w:rPr>
-          <w:noProof/>
-          <w:sz w:val="24"/>
-          <w:szCs w:val="24"/>
-        </w:rPr>
-      </w:pPr>
-      <w:r>
-        <w:rPr>
-          <w:noProof/>
-          <w:sz w:val="24"/>
-          <w:szCs w:val="24"/>
-        </w:rPr>
-        <w:t>Kalman trend forecast</w:t>
-      </w:r>
-    </w:p>
-    <w:p>
-      <w:pPr>
-        <w:spacing w:after="0" w:line="240" w:lineRule="auto"/>
-        <w:rPr>
-          <w:noProof/>
-          <w:sz w:val="24"/>
-          <w:szCs w:val="24"/>
-        </w:rPr>
-      </w:pPr>
-      <w:r>
-        <w:rPr>
-          <w:noProof/>
-          <w:sz w:val="24"/>
-          <w:szCs w:val="24"/>
-        </w:rPr>
-        <w:t xml:space="preserve">        </w:t>
-      </w:r>
-      <w:r>
-        <w:rPr>
-          <w:noProof/>
-          <w:sz w:val="24"/>
-          <w:szCs w:val="24"/>
-        </w:rPr>
-        <w:t xml:space="preserve"> </w:t>
-      </w:r>
-      <w:r>
-        <w:rPr>
-          <w:noProof/>
-          <w:sz w:val="24"/>
-          <w:szCs w:val="24"/>
-        </w:rPr>
-        <w:t>│</w:t>
-      </w:r>
-    </w:p>
-    <w:p>
-      <w:pPr>
-        <w:spacing w:after="0" w:line="240" w:lineRule="auto"/>
-        <w:rPr>
-          <w:noProof/>
-          <w:sz w:val="24"/>
-          <w:szCs w:val="24"/>
-        </w:rPr>
-      </w:pPr>
-      <w:r>
-        <w:rPr>
-          <w:noProof/>
-          <w:sz w:val="24"/>
-          <w:szCs w:val="24"/>
-        </w:rPr>
-        <w:t xml:space="preserve">        </w:t>
-      </w:r>
-      <w:r>
-        <w:rPr>
-          <w:rFonts w:ascii="Arial" w:hAnsi="Arial" w:cs="Arial"/>
-          <w:noProof/>
-          <w:sz w:val="24"/>
-          <w:szCs w:val="24"/>
-        </w:rPr>
-        <w:t>▼</w:t>
-      </w:r>
-    </w:p>
-    <w:p>
-      <w:pPr>
-        <w:spacing w:after="0" w:line="240" w:lineRule="auto"/>
-        <w:rPr>
-          <w:noProof/>
-          <w:sz w:val="24"/>
-          <w:szCs w:val="24"/>
-        </w:rPr>
-      </w:pPr>
-      <w:r>
-        <w:rPr>
-          <w:noProof/>
-          <w:sz w:val="24"/>
-          <w:szCs w:val="24"/>
-        </w:rPr>
-        <w:t>Final forecast</w:t>
-      </w:r>
-    </w:p>
-    <w:p>
-      <w:pPr>
-        <w:spacing w:after="0" w:line="240" w:lineRule="auto"/>
-        <w:rPr>
-          <w:noProof/>
-          <w:sz w:val="24"/>
-          <w:szCs w:val="24"/>
-        </w:rPr>
-      </w:pPr>
-    </w:p>
-    <w:p>
-      <w:pPr>
-        <w:spacing w:after="0" w:line="240" w:lineRule="auto"/>
-        <w:rPr>
-          <w:noProof/>
-          <w:sz w:val="24"/>
-          <w:szCs w:val="24"/>
-        </w:rPr>
-      </w:pPr>
-    </w:p>
-    <w:p>
-      <w:pPr>
-        <w:spacing w:after="0" w:line="240" w:lineRule="auto"/>
-        <w:rPr>
-          <w:noProof/>
-          <w:sz w:val="24"/>
-          <w:szCs w:val="24"/>
-        </w:rPr>
-      </w:pPr>
-    </w:p>
-    <w:p>
-      <w:pPr>
-        <w:spacing w:after="0" w:line="240" w:lineRule="auto"/>
+          <w:lang w:val="tr-TR"/>
+        </w:rPr>
+      </w:pPr>
+      <w:r>
         <w:rPr>
           <w:b/>
           <w:bCs/>
@@ -18502,31 +18502,8 @@
           <w:u w:val="single"/>
           <w:lang w:val="tr-TR"/>
         </w:rPr>
-      </w:pPr>
-      <w:r>
-        <w:rPr>
-          <w:b/>
-          <w:bCs/>
-          <w:noProof/>
-          <w:sz w:val="32"/>
-          <w:szCs w:val="32"/>
-          <w:u w:val="single"/>
-          <w:lang w:val="tr-TR"/>
-        </w:rPr>
         <w:lastRenderedPageBreak/>
-        <w:t xml:space="preserve">Commit </w:t>
-      </w:r>
-      <w:r>
-        <w:rPr>
-          <w:b/>
-          <w:bCs/>
-          <w:noProof/>
-          <w:sz w:val="32"/>
-          <w:szCs w:val="32"/>
-          <w:u w:val="single"/>
-          <w:lang w:val="tr-TR"/>
-        </w:rPr>
-        <w:t>5:</w:t>
+        <w:t>Commit 5:</w:t>
       </w:r>
     </w:p>
     <w:p>
@@ -20379,6 +20356,1969 @@
         </w:rPr>
         <w:t>inherited</w:t>
       </w:r>
+    </w:p>
+    <w:p>
+      <w:pPr>
+        <w:spacing w:after="0" w:line="240" w:lineRule="auto"/>
+        <w:rPr>
+          <w:noProof/>
+          <w:sz w:val="24"/>
+          <w:szCs w:val="24"/>
+        </w:rPr>
+      </w:pPr>
+    </w:p>
+    <w:p>
+      <w:pPr>
+        <w:spacing w:after="0" w:line="240" w:lineRule="auto"/>
+        <w:rPr>
+          <w:noProof/>
+          <w:sz w:val="24"/>
+          <w:szCs w:val="24"/>
+        </w:rPr>
+      </w:pPr>
+    </w:p>
+    <w:p>
+      <w:pPr>
+        <w:spacing w:after="0" w:line="240" w:lineRule="auto"/>
+        <w:rPr>
+          <w:b/>
+          <w:bCs/>
+          <w:noProof/>
+          <w:sz w:val="24"/>
+          <w:szCs w:val="24"/>
+          <w:u w:val="single"/>
+        </w:rPr>
+      </w:pPr>
+      <w:r>
+        <w:rPr>
+          <w:b/>
+          <w:bCs/>
+          <w:noProof/>
+          <w:sz w:val="24"/>
+          <w:szCs w:val="24"/>
+          <w:u w:val="single"/>
+        </w:rPr>
+        <w:t>Commit 5</w:t>
+      </w:r>
+      <w:r>
+        <w:rPr>
+          <w:b/>
+          <w:bCs/>
+          <w:noProof/>
+          <w:sz w:val="24"/>
+          <w:szCs w:val="24"/>
+          <w:u w:val="single"/>
+        </w:rPr>
+        <w:t>:</w:t>
+      </w:r>
+    </w:p>
+    <w:p>
+      <w:pPr>
+        <w:spacing w:after="0" w:line="240" w:lineRule="auto"/>
+        <w:rPr>
+          <w:noProof/>
+          <w:sz w:val="24"/>
+          <w:szCs w:val="24"/>
+        </w:rPr>
+      </w:pPr>
+    </w:p>
+    <w:p>
+      <w:pPr>
+        <w:spacing w:after="0" w:line="240" w:lineRule="auto"/>
+        <w:rPr>
+          <w:noProof/>
+          <w:sz w:val="24"/>
+          <w:szCs w:val="24"/>
+        </w:rPr>
+      </w:pPr>
+      <w:r>
+        <w:rPr>
+          <w:noProof/>
+          <w:sz w:val="24"/>
+          <w:szCs w:val="24"/>
+        </w:rPr>
+        <w:t>Refactor hybrid forecasting architecture</w:t>
+      </w:r>
+    </w:p>
+    <w:p>
+      <w:pPr>
+        <w:spacing w:after="0" w:line="240" w:lineRule="auto"/>
+        <w:rPr>
+          <w:noProof/>
+          <w:sz w:val="24"/>
+          <w:szCs w:val="24"/>
+        </w:rPr>
+      </w:pPr>
+    </w:p>
+    <w:p>
+      <w:pPr>
+        <w:spacing w:after="0" w:line="240" w:lineRule="auto"/>
+        <w:rPr>
+          <w:noProof/>
+          <w:sz w:val="24"/>
+          <w:szCs w:val="24"/>
+        </w:rPr>
+      </w:pPr>
+      <w:r>
+        <w:rPr>
+          <w:noProof/>
+          <w:sz w:val="24"/>
+          <w:szCs w:val="24"/>
+        </w:rPr>
+        <w:t>• redesigned BaseHybridForecaster</w:t>
+      </w:r>
+    </w:p>
+    <w:p>
+      <w:pPr>
+        <w:spacing w:after="0" w:line="240" w:lineRule="auto"/>
+        <w:rPr>
+          <w:noProof/>
+          <w:sz w:val="24"/>
+          <w:szCs w:val="24"/>
+        </w:rPr>
+      </w:pPr>
+      <w:r>
+        <w:rPr>
+          <w:noProof/>
+          <w:sz w:val="24"/>
+          <w:szCs w:val="24"/>
+        </w:rPr>
+        <w:t>• migrated LinearTrendLSTMForecaster</w:t>
+      </w:r>
+    </w:p>
+    <w:p>
+      <w:pPr>
+        <w:spacing w:after="0" w:line="240" w:lineRule="auto"/>
+        <w:rPr>
+          <w:noProof/>
+          <w:sz w:val="24"/>
+          <w:szCs w:val="24"/>
+        </w:rPr>
+      </w:pPr>
+      <w:r>
+        <w:rPr>
+          <w:noProof/>
+          <w:sz w:val="24"/>
+          <w:szCs w:val="24"/>
+        </w:rPr>
+        <w:t xml:space="preserve">• integrated AdaptiveKalmanFilter with </w:t>
+      </w:r>
+    </w:p>
+    <w:p>
+      <w:pPr>
+        <w:spacing w:after="0" w:line="240" w:lineRule="auto"/>
+        <w:rPr>
+          <w:noProof/>
+          <w:sz w:val="24"/>
+          <w:szCs w:val="24"/>
+        </w:rPr>
+      </w:pPr>
+      <w:r>
+        <w:rPr>
+          <w:noProof/>
+          <w:sz w:val="24"/>
+          <w:szCs w:val="24"/>
+        </w:rPr>
+        <w:t xml:space="preserve">   </w:t>
+      </w:r>
+      <w:r>
+        <w:rPr>
+          <w:noProof/>
+          <w:sz w:val="24"/>
+          <w:szCs w:val="24"/>
+        </w:rPr>
+        <w:t>BatteryDataset API</w:t>
+      </w:r>
+    </w:p>
+    <w:p>
+      <w:pPr>
+        <w:spacing w:after="0" w:line="240" w:lineRule="auto"/>
+        <w:rPr>
+          <w:noProof/>
+          <w:sz w:val="24"/>
+          <w:szCs w:val="24"/>
+        </w:rPr>
+      </w:pPr>
+      <w:r>
+        <w:rPr>
+          <w:noProof/>
+          <w:sz w:val="24"/>
+          <w:szCs w:val="24"/>
+        </w:rPr>
+        <w:t xml:space="preserve">• implemented Kalman residual </w:t>
+      </w:r>
+    </w:p>
+    <w:p>
+      <w:pPr>
+        <w:spacing w:after="0" w:line="240" w:lineRule="auto"/>
+        <w:rPr>
+          <w:noProof/>
+          <w:sz w:val="24"/>
+          <w:szCs w:val="24"/>
+        </w:rPr>
+      </w:pPr>
+      <w:r>
+        <w:rPr>
+          <w:noProof/>
+          <w:sz w:val="24"/>
+          <w:szCs w:val="24"/>
+        </w:rPr>
+        <w:t xml:space="preserve">   </w:t>
+      </w:r>
+      <w:r>
+        <w:rPr>
+          <w:noProof/>
+          <w:sz w:val="24"/>
+          <w:szCs w:val="24"/>
+        </w:rPr>
+        <w:t>preparation</w:t>
+      </w:r>
+    </w:p>
+    <w:p>
+      <w:pPr>
+        <w:spacing w:after="0" w:line="240" w:lineRule="auto"/>
+        <w:rPr>
+          <w:noProof/>
+          <w:sz w:val="24"/>
+          <w:szCs w:val="24"/>
+        </w:rPr>
+      </w:pPr>
+      <w:r>
+        <w:rPr>
+          <w:noProof/>
+          <w:sz w:val="24"/>
+          <w:szCs w:val="24"/>
+        </w:rPr>
+        <w:t>• updated hybrid tests</w:t>
+      </w:r>
+    </w:p>
+    <w:p>
+      <w:pPr>
+        <w:spacing w:after="0" w:line="240" w:lineRule="auto"/>
+        <w:rPr>
+          <w:noProof/>
+          <w:sz w:val="24"/>
+          <w:szCs w:val="24"/>
+        </w:rPr>
+      </w:pPr>
+      <w:r>
+        <w:rPr>
+          <w:noProof/>
+          <w:sz w:val="24"/>
+          <w:szCs w:val="24"/>
+        </w:rPr>
+        <w:t>• all tests passing (78 passed)</w:t>
+      </w:r>
+    </w:p>
+    <w:p>
+      <w:pPr>
+        <w:spacing w:after="0" w:line="240" w:lineRule="auto"/>
+        <w:rPr>
+          <w:b/>
+          <w:bCs/>
+          <w:noProof/>
+          <w:sz w:val="32"/>
+          <w:szCs w:val="32"/>
+          <w:u w:val="single"/>
+        </w:rPr>
+      </w:pPr>
+      <w:r>
+        <w:rPr>
+          <w:b/>
+          <w:bCs/>
+          <w:noProof/>
+          <w:sz w:val="32"/>
+          <w:szCs w:val="32"/>
+          <w:u w:val="single"/>
+        </w:rPr>
+        <w:lastRenderedPageBreak/>
+        <w:t>forecast_trend()</w:t>
+      </w:r>
+      <w:r>
+        <w:rPr>
+          <w:b/>
+          <w:bCs/>
+          <w:noProof/>
+          <w:sz w:val="32"/>
+          <w:szCs w:val="32"/>
+          <w:u w:val="single"/>
+        </w:rPr>
+        <w:t>:</w:t>
+      </w:r>
+    </w:p>
+    <w:p>
+      <w:pPr>
+        <w:spacing w:after="0" w:line="240" w:lineRule="auto"/>
+        <w:rPr>
+          <w:noProof/>
+          <w:sz w:val="24"/>
+          <w:szCs w:val="24"/>
+        </w:rPr>
+      </w:pPr>
+    </w:p>
+    <w:p>
+      <w:pPr>
+        <w:spacing w:after="0" w:line="240" w:lineRule="auto"/>
+        <w:rPr>
+          <w:noProof/>
+          <w:sz w:val="24"/>
+          <w:szCs w:val="24"/>
+        </w:rPr>
+      </w:pPr>
+      <w:r>
+        <w:rPr>
+          <w:noProof/>
+          <w:sz w:val="24"/>
+          <w:szCs w:val="24"/>
+        </w:rPr>
+        <w:t>Kalman filter</w:t>
+      </w:r>
+    </w:p>
+    <w:p>
+      <w:pPr>
+        <w:spacing w:after="0" w:line="240" w:lineRule="auto"/>
+        <w:rPr>
+          <w:noProof/>
+          <w:sz w:val="24"/>
+          <w:szCs w:val="24"/>
+        </w:rPr>
+      </w:pPr>
+      <w:r>
+        <w:rPr>
+          <w:noProof/>
+          <w:sz w:val="24"/>
+          <w:szCs w:val="24"/>
+        </w:rPr>
+        <w:t xml:space="preserve">      </w:t>
+      </w:r>
+      <w:r>
+        <w:rPr>
+          <w:noProof/>
+          <w:sz w:val="24"/>
+          <w:szCs w:val="24"/>
+        </w:rPr>
+        <w:t xml:space="preserve"> </w:t>
+      </w:r>
+      <w:r>
+        <w:rPr>
+          <w:noProof/>
+          <w:sz w:val="24"/>
+          <w:szCs w:val="24"/>
+        </w:rPr>
+        <w:t>│</w:t>
+      </w:r>
+    </w:p>
+    <w:p>
+      <w:pPr>
+        <w:spacing w:after="0" w:line="240" w:lineRule="auto"/>
+        <w:rPr>
+          <w:noProof/>
+          <w:sz w:val="24"/>
+          <w:szCs w:val="24"/>
+        </w:rPr>
+      </w:pPr>
+      <w:r>
+        <w:rPr>
+          <w:noProof/>
+          <w:sz w:val="24"/>
+          <w:szCs w:val="24"/>
+        </w:rPr>
+        <w:t xml:space="preserve">      </w:t>
+      </w:r>
+      <w:r>
+        <w:rPr>
+          <w:rFonts w:ascii="Arial" w:hAnsi="Arial" w:cs="Arial"/>
+          <w:noProof/>
+          <w:sz w:val="24"/>
+          <w:szCs w:val="24"/>
+        </w:rPr>
+        <w:t>▼</w:t>
+      </w:r>
+    </w:p>
+    <w:p>
+      <w:pPr>
+        <w:spacing w:after="0" w:line="240" w:lineRule="auto"/>
+        <w:rPr>
+          <w:noProof/>
+          <w:sz w:val="24"/>
+          <w:szCs w:val="24"/>
+        </w:rPr>
+      </w:pPr>
+      <w:r>
+        <w:rPr>
+          <w:noProof/>
+          <w:sz w:val="24"/>
+          <w:szCs w:val="24"/>
+        </w:rPr>
+        <w:t>last smoothed state</w:t>
+      </w:r>
+    </w:p>
+    <w:p>
+      <w:pPr>
+        <w:spacing w:after="0" w:line="240" w:lineRule="auto"/>
+        <w:rPr>
+          <w:noProof/>
+          <w:sz w:val="24"/>
+          <w:szCs w:val="24"/>
+        </w:rPr>
+      </w:pPr>
+      <w:r>
+        <w:rPr>
+          <w:noProof/>
+          <w:sz w:val="24"/>
+          <w:szCs w:val="24"/>
+        </w:rPr>
+        <w:t xml:space="preserve">      </w:t>
+      </w:r>
+      <w:r>
+        <w:rPr>
+          <w:noProof/>
+          <w:sz w:val="24"/>
+          <w:szCs w:val="24"/>
+        </w:rPr>
+        <w:t xml:space="preserve"> </w:t>
+      </w:r>
+      <w:r>
+        <w:rPr>
+          <w:noProof/>
+          <w:sz w:val="24"/>
+          <w:szCs w:val="24"/>
+        </w:rPr>
+        <w:t>│</w:t>
+      </w:r>
+    </w:p>
+    <w:p>
+      <w:pPr>
+        <w:spacing w:after="0" w:line="240" w:lineRule="auto"/>
+        <w:rPr>
+          <w:noProof/>
+          <w:sz w:val="24"/>
+          <w:szCs w:val="24"/>
+        </w:rPr>
+      </w:pPr>
+      <w:r>
+        <w:rPr>
+          <w:noProof/>
+          <w:sz w:val="24"/>
+          <w:szCs w:val="24"/>
+        </w:rPr>
+        <w:t xml:space="preserve">      </w:t>
+      </w:r>
+      <w:r>
+        <w:rPr>
+          <w:rFonts w:ascii="Arial" w:hAnsi="Arial" w:cs="Arial"/>
+          <w:noProof/>
+          <w:sz w:val="24"/>
+          <w:szCs w:val="24"/>
+        </w:rPr>
+        <w:t>▼</w:t>
+      </w:r>
+    </w:p>
+    <w:p>
+      <w:pPr>
+        <w:spacing w:after="0" w:line="240" w:lineRule="auto"/>
+        <w:rPr>
+          <w:noProof/>
+          <w:sz w:val="24"/>
+          <w:szCs w:val="24"/>
+        </w:rPr>
+      </w:pPr>
+      <w:r>
+        <w:rPr>
+          <w:noProof/>
+          <w:sz w:val="24"/>
+          <w:szCs w:val="24"/>
+        </w:rPr>
+        <w:t>state transition</w:t>
+      </w:r>
+    </w:p>
+    <w:p>
+      <w:pPr>
+        <w:spacing w:after="0" w:line="240" w:lineRule="auto"/>
+        <w:rPr>
+          <w:noProof/>
+          <w:sz w:val="24"/>
+          <w:szCs w:val="24"/>
+        </w:rPr>
+      </w:pPr>
+      <w:r>
+        <w:rPr>
+          <w:noProof/>
+          <w:sz w:val="24"/>
+          <w:szCs w:val="24"/>
+        </w:rPr>
+        <w:t xml:space="preserve">      </w:t>
+      </w:r>
+      <w:r>
+        <w:rPr>
+          <w:noProof/>
+          <w:sz w:val="24"/>
+          <w:szCs w:val="24"/>
+        </w:rPr>
+        <w:t xml:space="preserve"> </w:t>
+      </w:r>
+      <w:r>
+        <w:rPr>
+          <w:noProof/>
+          <w:sz w:val="24"/>
+          <w:szCs w:val="24"/>
+        </w:rPr>
+        <w:t>│</w:t>
+      </w:r>
+    </w:p>
+    <w:p>
+      <w:pPr>
+        <w:spacing w:after="0" w:line="240" w:lineRule="auto"/>
+        <w:rPr>
+          <w:noProof/>
+          <w:sz w:val="24"/>
+          <w:szCs w:val="24"/>
+        </w:rPr>
+      </w:pPr>
+      <w:r>
+        <w:rPr>
+          <w:noProof/>
+          <w:sz w:val="24"/>
+          <w:szCs w:val="24"/>
+        </w:rPr>
+        <w:t xml:space="preserve">      </w:t>
+      </w:r>
+      <w:r>
+        <w:rPr>
+          <w:rFonts w:ascii="Arial" w:hAnsi="Arial" w:cs="Arial"/>
+          <w:noProof/>
+          <w:sz w:val="24"/>
+          <w:szCs w:val="24"/>
+        </w:rPr>
+        <w:t>▼</w:t>
+      </w:r>
+    </w:p>
+    <w:p>
+      <w:pPr>
+        <w:spacing w:after="0" w:line="240" w:lineRule="auto"/>
+        <w:rPr>
+          <w:noProof/>
+          <w:sz w:val="24"/>
+          <w:szCs w:val="24"/>
+        </w:rPr>
+      </w:pPr>
+      <w:r>
+        <w:rPr>
+          <w:noProof/>
+          <w:sz w:val="24"/>
+          <w:szCs w:val="24"/>
+        </w:rPr>
+        <w:t>future trend</w:t>
+      </w:r>
+    </w:p>
+    <w:p>
+      <w:pPr>
+        <w:spacing w:after="0" w:line="240" w:lineRule="auto"/>
+        <w:rPr>
+          <w:noProof/>
+          <w:sz w:val="24"/>
+          <w:szCs w:val="24"/>
+        </w:rPr>
+      </w:pPr>
+      <w:r>
+        <w:rPr>
+          <w:noProof/>
+          <w:sz w:val="24"/>
+          <w:szCs w:val="24"/>
+        </w:rPr>
+        <w:t xml:space="preserve">      </w:t>
+      </w:r>
+      <w:r>
+        <w:rPr>
+          <w:noProof/>
+          <w:sz w:val="24"/>
+          <w:szCs w:val="24"/>
+        </w:rPr>
+        <w:t xml:space="preserve"> </w:t>
+      </w:r>
+      <w:r>
+        <w:rPr>
+          <w:noProof/>
+          <w:sz w:val="24"/>
+          <w:szCs w:val="24"/>
+        </w:rPr>
+        <w:t>│</w:t>
+      </w:r>
+    </w:p>
+    <w:p>
+      <w:pPr>
+        <w:spacing w:after="0" w:line="240" w:lineRule="auto"/>
+        <w:rPr>
+          <w:noProof/>
+          <w:sz w:val="24"/>
+          <w:szCs w:val="24"/>
+        </w:rPr>
+      </w:pPr>
+      <w:r>
+        <w:rPr>
+          <w:noProof/>
+          <w:sz w:val="24"/>
+          <w:szCs w:val="24"/>
+        </w:rPr>
+        <w:t xml:space="preserve">      </w:t>
+      </w:r>
+      <w:r>
+        <w:rPr>
+          <w:rFonts w:ascii="Arial" w:hAnsi="Arial" w:cs="Arial"/>
+          <w:noProof/>
+          <w:sz w:val="24"/>
+          <w:szCs w:val="24"/>
+        </w:rPr>
+        <w:t>▼</w:t>
+      </w:r>
+    </w:p>
+    <w:p>
+      <w:pPr>
+        <w:spacing w:after="0" w:line="240" w:lineRule="auto"/>
+        <w:rPr>
+          <w:noProof/>
+          <w:sz w:val="24"/>
+          <w:szCs w:val="24"/>
+        </w:rPr>
+      </w:pPr>
+      <w:r>
+        <w:rPr>
+          <w:noProof/>
+          <w:sz w:val="24"/>
+          <w:szCs w:val="24"/>
+        </w:rPr>
+        <w:t>ForecastResult</w:t>
+      </w:r>
+    </w:p>
+    <w:p>
+      <w:pPr>
+        <w:spacing w:after="0" w:line="240" w:lineRule="auto"/>
+        <w:rPr>
+          <w:noProof/>
+          <w:sz w:val="24"/>
+          <w:szCs w:val="24"/>
+        </w:rPr>
+      </w:pPr>
+    </w:p>
+    <w:p>
+      <w:pPr>
+        <w:spacing w:after="0" w:line="240" w:lineRule="auto"/>
+        <w:rPr>
+          <w:noProof/>
+          <w:sz w:val="24"/>
+          <w:szCs w:val="24"/>
+        </w:rPr>
+      </w:pPr>
+    </w:p>
+    <w:p>
+      <w:pPr>
+        <w:spacing w:after="0" w:line="240" w:lineRule="auto"/>
+        <w:rPr>
+          <w:noProof/>
+          <w:sz w:val="24"/>
+          <w:szCs w:val="24"/>
+        </w:rPr>
+      </w:pPr>
+    </w:p>
+    <w:p>
+      <w:pPr>
+        <w:spacing w:after="0" w:line="240" w:lineRule="auto"/>
+        <w:rPr>
+          <w:b/>
+          <w:bCs/>
+          <w:noProof/>
+          <w:sz w:val="32"/>
+          <w:szCs w:val="32"/>
+        </w:rPr>
+      </w:pPr>
+      <w:r>
+        <w:rPr>
+          <w:b/>
+          <w:bCs/>
+          <w:noProof/>
+          <w:sz w:val="32"/>
+          <w:szCs w:val="32"/>
+        </w:rPr>
+        <w:t>AdaptiveKalmanFilter</w:t>
+      </w:r>
+    </w:p>
+    <w:p>
+      <w:pPr>
+        <w:spacing w:after="0" w:line="240" w:lineRule="auto"/>
+        <w:rPr>
+          <w:b/>
+          <w:bCs/>
+          <w:noProof/>
+          <w:sz w:val="32"/>
+          <w:szCs w:val="32"/>
+        </w:rPr>
+      </w:pPr>
+    </w:p>
+    <w:p>
+      <w:pPr>
+        <w:spacing w:after="0" w:line="240" w:lineRule="auto"/>
+        <w:rPr>
+          <w:noProof/>
+          <w:sz w:val="24"/>
+          <w:szCs w:val="24"/>
+        </w:rPr>
+      </w:pPr>
+      <w:r>
+        <w:rPr>
+          <w:noProof/>
+          <w:sz w:val="24"/>
+          <w:szCs w:val="24"/>
+        </w:rPr>
+        <w:t xml:space="preserve"> </w:t>
+      </w:r>
+      <w:r>
+        <w:rPr>
+          <w:noProof/>
+          <w:sz w:val="24"/>
+          <w:szCs w:val="24"/>
+        </w:rPr>
+        <w:t>│</w:t>
+      </w:r>
+    </w:p>
+    <w:p>
+      <w:pPr>
+        <w:spacing w:after="0" w:line="240" w:lineRule="auto"/>
+        <w:rPr>
+          <w:noProof/>
+          <w:sz w:val="24"/>
+          <w:szCs w:val="24"/>
+        </w:rPr>
+      </w:pPr>
+      <w:r>
+        <w:rPr>
+          <w:rFonts w:ascii="MS Gothic" w:eastAsia="MS Gothic" w:hAnsi="MS Gothic" w:cs="MS Gothic" w:hint="eastAsia"/>
+          <w:noProof/>
+          <w:sz w:val="24"/>
+          <w:szCs w:val="24"/>
+        </w:rPr>
+        <w:t>├</w:t>
+      </w:r>
+      <w:r>
+        <w:rPr>
+          <w:rFonts w:ascii="Calibri" w:hAnsi="Calibri" w:cs="Calibri"/>
+          <w:noProof/>
+          <w:sz w:val="24"/>
+          <w:szCs w:val="24"/>
+        </w:rPr>
+        <w:t>──</w:t>
+      </w:r>
+      <w:r>
+        <w:rPr>
+          <w:noProof/>
+          <w:sz w:val="24"/>
+          <w:szCs w:val="24"/>
+        </w:rPr>
+        <w:t xml:space="preserve"> self.states</w:t>
+      </w:r>
+    </w:p>
+    <w:p>
+      <w:pPr>
+        <w:spacing w:after="0" w:line="240" w:lineRule="auto"/>
+        <w:rPr>
+          <w:noProof/>
+          <w:sz w:val="24"/>
+          <w:szCs w:val="24"/>
+        </w:rPr>
+      </w:pPr>
+      <w:r>
+        <w:rPr>
+          <w:noProof/>
+          <w:sz w:val="24"/>
+          <w:szCs w:val="24"/>
+        </w:rPr>
+        <w:t xml:space="preserve"> </w:t>
+      </w:r>
+      <w:r>
+        <w:rPr>
+          <w:noProof/>
+          <w:sz w:val="24"/>
+          <w:szCs w:val="24"/>
+        </w:rPr>
+        <w:t>│      full filtering history</w:t>
+      </w:r>
+    </w:p>
+    <w:p>
+      <w:pPr>
+        <w:spacing w:after="0" w:line="240" w:lineRule="auto"/>
+        <w:rPr>
+          <w:noProof/>
+          <w:sz w:val="24"/>
+          <w:szCs w:val="24"/>
+        </w:rPr>
+      </w:pPr>
+      <w:r>
+        <w:rPr>
+          <w:noProof/>
+          <w:sz w:val="24"/>
+          <w:szCs w:val="24"/>
+        </w:rPr>
+        <w:t xml:space="preserve"> </w:t>
+      </w:r>
+      <w:r>
+        <w:rPr>
+          <w:noProof/>
+          <w:sz w:val="24"/>
+          <w:szCs w:val="24"/>
+        </w:rPr>
+        <w:t>│</w:t>
+      </w:r>
+    </w:p>
+    <w:p>
+      <w:pPr>
+        <w:spacing w:after="0" w:line="240" w:lineRule="auto"/>
+        <w:rPr>
+          <w:noProof/>
+          <w:sz w:val="24"/>
+          <w:szCs w:val="24"/>
+        </w:rPr>
+      </w:pPr>
+      <w:r>
+        <w:rPr>
+          <w:rFonts w:ascii="MS Gothic" w:eastAsia="MS Gothic" w:hAnsi="MS Gothic" w:cs="MS Gothic" w:hint="eastAsia"/>
+          <w:noProof/>
+          <w:sz w:val="24"/>
+          <w:szCs w:val="24"/>
+        </w:rPr>
+        <w:t>├</w:t>
+      </w:r>
+      <w:r>
+        <w:rPr>
+          <w:rFonts w:ascii="Calibri" w:hAnsi="Calibri" w:cs="Calibri"/>
+          <w:noProof/>
+          <w:sz w:val="24"/>
+          <w:szCs w:val="24"/>
+        </w:rPr>
+        <w:t>──</w:t>
+      </w:r>
+      <w:r>
+        <w:rPr>
+          <w:noProof/>
+          <w:sz w:val="24"/>
+          <w:szCs w:val="24"/>
+        </w:rPr>
+        <w:t xml:space="preserve"> self.state</w:t>
+      </w:r>
+    </w:p>
+    <w:p>
+      <w:pPr>
+        <w:spacing w:after="0" w:line="240" w:lineRule="auto"/>
+        <w:rPr>
+          <w:noProof/>
+          <w:sz w:val="24"/>
+          <w:szCs w:val="24"/>
+        </w:rPr>
+      </w:pPr>
+      <w:r>
+        <w:rPr>
+          <w:noProof/>
+          <w:sz w:val="24"/>
+          <w:szCs w:val="24"/>
+        </w:rPr>
+        <w:t xml:space="preserve"> </w:t>
+      </w:r>
+      <w:r>
+        <w:rPr>
+          <w:noProof/>
+          <w:sz w:val="24"/>
+          <w:szCs w:val="24"/>
+        </w:rPr>
+        <w:t>│      last state</w:t>
+      </w:r>
+    </w:p>
+    <w:p>
+      <w:pPr>
+        <w:spacing w:after="0" w:line="240" w:lineRule="auto"/>
+        <w:rPr>
+          <w:noProof/>
+          <w:sz w:val="24"/>
+          <w:szCs w:val="24"/>
+        </w:rPr>
+      </w:pPr>
+      <w:r>
+        <w:rPr>
+          <w:noProof/>
+          <w:sz w:val="24"/>
+          <w:szCs w:val="24"/>
+        </w:rPr>
+        <w:t xml:space="preserve"> </w:t>
+      </w:r>
+      <w:r>
+        <w:rPr>
+          <w:noProof/>
+          <w:sz w:val="24"/>
+          <w:szCs w:val="24"/>
+        </w:rPr>
+        <w:t>│</w:t>
+      </w:r>
+    </w:p>
+    <w:p>
+      <w:pPr>
+        <w:spacing w:after="0" w:line="240" w:lineRule="auto"/>
+        <w:rPr>
+          <w:noProof/>
+          <w:sz w:val="24"/>
+          <w:szCs w:val="24"/>
+        </w:rPr>
+      </w:pPr>
+      <w:r>
+        <w:rPr>
+          <w:rFonts w:ascii="MS Gothic" w:eastAsia="MS Gothic" w:hAnsi="MS Gothic" w:cs="MS Gothic" w:hint="eastAsia"/>
+          <w:noProof/>
+          <w:sz w:val="24"/>
+          <w:szCs w:val="24"/>
+        </w:rPr>
+        <w:t>├</w:t>
+      </w:r>
+      <w:r>
+        <w:rPr>
+          <w:rFonts w:ascii="Calibri" w:hAnsi="Calibri" w:cs="Calibri"/>
+          <w:noProof/>
+          <w:sz w:val="24"/>
+          <w:szCs w:val="24"/>
+        </w:rPr>
+        <w:t>──</w:t>
+      </w:r>
+      <w:r>
+        <w:rPr>
+          <w:noProof/>
+          <w:sz w:val="24"/>
+          <w:szCs w:val="24"/>
+        </w:rPr>
+        <w:t xml:space="preserve"> self.covariance</w:t>
+      </w:r>
+    </w:p>
+    <w:p>
+      <w:pPr>
+        <w:spacing w:after="0" w:line="240" w:lineRule="auto"/>
+        <w:rPr>
+          <w:noProof/>
+          <w:sz w:val="24"/>
+          <w:szCs w:val="24"/>
+        </w:rPr>
+      </w:pPr>
+      <w:r>
+        <w:rPr>
+          <w:noProof/>
+          <w:sz w:val="24"/>
+          <w:szCs w:val="24"/>
+        </w:rPr>
+        <w:t xml:space="preserve"> </w:t>
+      </w:r>
+      <w:r>
+        <w:rPr>
+          <w:noProof/>
+          <w:sz w:val="24"/>
+          <w:szCs w:val="24"/>
+        </w:rPr>
+        <w:t>│      last covariance</w:t>
+      </w:r>
+    </w:p>
+    <w:p>
+      <w:pPr>
+        <w:spacing w:after="0" w:line="240" w:lineRule="auto"/>
+        <w:rPr>
+          <w:noProof/>
+          <w:sz w:val="24"/>
+          <w:szCs w:val="24"/>
+        </w:rPr>
+      </w:pPr>
+      <w:r>
+        <w:rPr>
+          <w:noProof/>
+          <w:sz w:val="24"/>
+          <w:szCs w:val="24"/>
+        </w:rPr>
+        <w:t xml:space="preserve"> </w:t>
+      </w:r>
+      <w:r>
+        <w:rPr>
+          <w:noProof/>
+          <w:sz w:val="24"/>
+          <w:szCs w:val="24"/>
+        </w:rPr>
+        <w:t>│</w:t>
+      </w:r>
+    </w:p>
+    <w:p>
+      <w:pPr>
+        <w:spacing w:after="0" w:line="240" w:lineRule="auto"/>
+        <w:rPr>
+          <w:noProof/>
+          <w:sz w:val="24"/>
+          <w:szCs w:val="24"/>
+        </w:rPr>
+      </w:pPr>
+      <w:r>
+        <w:rPr>
+          <w:noProof/>
+          <w:sz w:val="24"/>
+          <w:szCs w:val="24"/>
+        </w:rPr>
+        <w:t xml:space="preserve"> </w:t>
+      </w:r>
+      <w:r>
+        <w:rPr>
+          <w:noProof/>
+          <w:sz w:val="24"/>
+          <w:szCs w:val="24"/>
+        </w:rPr>
+        <w:t>└── forecast()</w:t>
+      </w:r>
+    </w:p>
+    <w:p>
+      <w:pPr>
+        <w:spacing w:after="0" w:line="240" w:lineRule="auto"/>
+        <w:rPr>
+          <w:noProof/>
+          <w:sz w:val="24"/>
+          <w:szCs w:val="24"/>
+        </w:rPr>
+      </w:pPr>
+      <w:r>
+        <w:rPr>
+          <w:noProof/>
+          <w:sz w:val="24"/>
+          <w:szCs w:val="24"/>
+        </w:rPr>
+        <w:t xml:space="preserve">       </w:t>
+      </w:r>
+      <w:r>
+        <w:rPr>
+          <w:noProof/>
+          <w:sz w:val="24"/>
+          <w:szCs w:val="24"/>
+        </w:rPr>
+        <w:t xml:space="preserve"> </w:t>
+      </w:r>
+      <w:r>
+        <w:rPr>
+          <w:noProof/>
+          <w:sz w:val="24"/>
+          <w:szCs w:val="24"/>
+        </w:rPr>
+        <w:t>uses only self.state</w:t>
+      </w:r>
+    </w:p>
+    <w:p>
+      <w:pPr>
+        <w:spacing w:after="0" w:line="240" w:lineRule="auto"/>
+        <w:rPr>
+          <w:noProof/>
+          <w:sz w:val="24"/>
+          <w:szCs w:val="24"/>
+        </w:rPr>
+      </w:pPr>
+    </w:p>
+    <w:p>
+      <w:pPr>
+        <w:spacing w:after="0" w:line="240" w:lineRule="auto"/>
+        <w:rPr>
+          <w:noProof/>
+          <w:sz w:val="24"/>
+          <w:szCs w:val="24"/>
+        </w:rPr>
+      </w:pPr>
+    </w:p>
+    <w:p>
+      <w:pPr>
+        <w:spacing w:after="0" w:line="240" w:lineRule="auto"/>
+        <w:rPr>
+          <w:noProof/>
+          <w:sz w:val="24"/>
+          <w:szCs w:val="24"/>
+        </w:rPr>
+      </w:pPr>
+    </w:p>
+    <w:p>
+      <w:pPr>
+        <w:spacing w:after="0" w:line="240" w:lineRule="auto"/>
+        <w:rPr>
+          <w:noProof/>
+          <w:sz w:val="24"/>
+          <w:szCs w:val="24"/>
+        </w:rPr>
+      </w:pPr>
+    </w:p>
+    <w:p>
+      <w:pPr>
+        <w:spacing w:after="0" w:line="240" w:lineRule="auto"/>
+        <w:rPr>
+          <w:noProof/>
+          <w:sz w:val="24"/>
+          <w:szCs w:val="24"/>
+        </w:rPr>
+      </w:pPr>
+    </w:p>
+    <w:p>
+      <w:pPr>
+        <w:spacing w:after="0" w:line="240" w:lineRule="auto"/>
+        <w:rPr>
+          <w:noProof/>
+          <w:sz w:val="24"/>
+          <w:szCs w:val="24"/>
+        </w:rPr>
+      </w:pPr>
+    </w:p>
+    <w:p>
+      <w:pPr>
+        <w:spacing w:after="0" w:line="240" w:lineRule="auto"/>
+        <w:rPr>
+          <w:noProof/>
+          <w:sz w:val="24"/>
+          <w:szCs w:val="24"/>
+        </w:rPr>
+      </w:pPr>
+    </w:p>
+    <w:p>
+      <w:pPr>
+        <w:spacing w:after="0" w:line="240" w:lineRule="auto"/>
+        <w:rPr>
+          <w:noProof/>
+          <w:sz w:val="24"/>
+          <w:szCs w:val="24"/>
+        </w:rPr>
+      </w:pPr>
+    </w:p>
+    <w:p>
+      <w:pPr>
+        <w:spacing w:after="0" w:line="240" w:lineRule="auto"/>
+        <w:rPr>
+          <w:noProof/>
+          <w:sz w:val="24"/>
+          <w:szCs w:val="24"/>
+        </w:rPr>
+      </w:pPr>
+    </w:p>
+    <w:p>
+      <w:pPr>
+        <w:spacing w:after="0" w:line="240" w:lineRule="auto"/>
+        <w:rPr>
+          <w:noProof/>
+          <w:sz w:val="24"/>
+          <w:szCs w:val="24"/>
+        </w:rPr>
+      </w:pPr>
+    </w:p>
+    <w:p>
+      <w:pPr>
+        <w:spacing w:after="0" w:line="240" w:lineRule="auto"/>
+        <w:rPr>
+          <w:noProof/>
+          <w:sz w:val="24"/>
+          <w:szCs w:val="24"/>
+        </w:rPr>
+      </w:pPr>
+    </w:p>
+    <w:p>
+      <w:pPr>
+        <w:spacing w:after="0" w:line="240" w:lineRule="auto"/>
+        <w:rPr>
+          <w:noProof/>
+          <w:sz w:val="24"/>
+          <w:szCs w:val="24"/>
+        </w:rPr>
+      </w:pPr>
+    </w:p>
+    <w:p>
+      <w:pPr>
+        <w:spacing w:after="0" w:line="240" w:lineRule="auto"/>
+        <w:rPr>
+          <w:noProof/>
+          <w:sz w:val="24"/>
+          <w:szCs w:val="24"/>
+        </w:rPr>
+      </w:pPr>
+    </w:p>
+    <w:p>
+      <w:pPr>
+        <w:spacing w:after="0" w:line="240" w:lineRule="auto"/>
+        <w:rPr>
+          <w:noProof/>
+          <w:sz w:val="24"/>
+          <w:szCs w:val="24"/>
+        </w:rPr>
+      </w:pPr>
+    </w:p>
+    <w:p>
+      <w:pPr>
+        <w:spacing w:after="0" w:line="240" w:lineRule="auto"/>
+        <w:rPr>
+          <w:b/>
+          <w:bCs/>
+          <w:noProof/>
+          <w:sz w:val="28"/>
+          <w:szCs w:val="28"/>
+          <w:u w:val="single"/>
+        </w:rPr>
+      </w:pPr>
+      <w:r>
+        <w:rPr>
+          <w:b/>
+          <w:bCs/>
+          <w:noProof/>
+          <w:sz w:val="28"/>
+          <w:szCs w:val="28"/>
+          <w:u w:val="single"/>
+        </w:rPr>
+        <w:t>KalmanLSTMForecaster:</w:t>
+      </w:r>
+    </w:p>
+    <w:p>
+      <w:pPr>
+        <w:spacing w:after="0" w:line="240" w:lineRule="auto"/>
+        <w:rPr>
+          <w:noProof/>
+          <w:sz w:val="24"/>
+          <w:szCs w:val="24"/>
+        </w:rPr>
+      </w:pPr>
+    </w:p>
+    <w:p>
+      <w:pPr>
+        <w:spacing w:after="0" w:line="240" w:lineRule="auto"/>
+        <w:rPr>
+          <w:noProof/>
+          <w:sz w:val="24"/>
+          <w:szCs w:val="24"/>
+        </w:rPr>
+      </w:pPr>
+      <w:r>
+        <w:rPr>
+          <w:noProof/>
+          <w:sz w:val="24"/>
+          <w:szCs w:val="24"/>
+        </w:rPr>
+        <w:t>BatteryDataset</w:t>
+      </w:r>
+    </w:p>
+    <w:p>
+      <w:pPr>
+        <w:spacing w:after="0" w:line="240" w:lineRule="auto"/>
+        <w:rPr>
+          <w:noProof/>
+          <w:sz w:val="24"/>
+          <w:szCs w:val="24"/>
+        </w:rPr>
+      </w:pPr>
+      <w:r>
+        <w:rPr>
+          <w:noProof/>
+          <w:sz w:val="24"/>
+          <w:szCs w:val="24"/>
+        </w:rPr>
+        <w:t xml:space="preserve">        </w:t>
+      </w:r>
+      <w:r>
+        <w:rPr>
+          <w:noProof/>
+          <w:sz w:val="24"/>
+          <w:szCs w:val="24"/>
+        </w:rPr>
+        <w:t xml:space="preserve"> </w:t>
+      </w:r>
+      <w:r>
+        <w:rPr>
+          <w:noProof/>
+          <w:sz w:val="24"/>
+          <w:szCs w:val="24"/>
+        </w:rPr>
+        <w:t>│</w:t>
+      </w:r>
+    </w:p>
+    <w:p>
+      <w:pPr>
+        <w:spacing w:after="0" w:line="240" w:lineRule="auto"/>
+        <w:rPr>
+          <w:noProof/>
+          <w:sz w:val="24"/>
+          <w:szCs w:val="24"/>
+        </w:rPr>
+      </w:pPr>
+      <w:r>
+        <w:rPr>
+          <w:noProof/>
+          <w:sz w:val="24"/>
+          <w:szCs w:val="24"/>
+        </w:rPr>
+        <w:t xml:space="preserve">        </w:t>
+      </w:r>
+      <w:r>
+        <w:rPr>
+          <w:rFonts w:ascii="Arial" w:hAnsi="Arial" w:cs="Arial"/>
+          <w:noProof/>
+          <w:sz w:val="24"/>
+          <w:szCs w:val="24"/>
+        </w:rPr>
+        <w:t>▼</w:t>
+      </w:r>
+    </w:p>
+    <w:p>
+      <w:pPr>
+        <w:spacing w:after="0" w:line="240" w:lineRule="auto"/>
+        <w:rPr>
+          <w:noProof/>
+          <w:sz w:val="24"/>
+          <w:szCs w:val="24"/>
+        </w:rPr>
+      </w:pPr>
+      <w:r>
+        <w:rPr>
+          <w:noProof/>
+          <w:sz w:val="24"/>
+          <w:szCs w:val="24"/>
+        </w:rPr>
+        <w:t>forecast_trend()</w:t>
+      </w:r>
+    </w:p>
+    <w:p>
+      <w:pPr>
+        <w:spacing w:after="0" w:line="240" w:lineRule="auto"/>
+        <w:rPr>
+          <w:noProof/>
+          <w:sz w:val="24"/>
+          <w:szCs w:val="24"/>
+        </w:rPr>
+      </w:pPr>
+      <w:r>
+        <w:rPr>
+          <w:noProof/>
+          <w:sz w:val="24"/>
+          <w:szCs w:val="24"/>
+        </w:rPr>
+        <w:t xml:space="preserve">        </w:t>
+      </w:r>
+      <w:r>
+        <w:rPr>
+          <w:noProof/>
+          <w:sz w:val="24"/>
+          <w:szCs w:val="24"/>
+        </w:rPr>
+        <w:t xml:space="preserve"> </w:t>
+      </w:r>
+      <w:r>
+        <w:rPr>
+          <w:noProof/>
+          <w:sz w:val="24"/>
+          <w:szCs w:val="24"/>
+        </w:rPr>
+        <w:t>│</w:t>
+      </w:r>
+    </w:p>
+    <w:p>
+      <w:pPr>
+        <w:spacing w:after="0" w:line="240" w:lineRule="auto"/>
+        <w:rPr>
+          <w:noProof/>
+          <w:sz w:val="24"/>
+          <w:szCs w:val="24"/>
+        </w:rPr>
+      </w:pPr>
+      <w:r>
+        <w:rPr>
+          <w:noProof/>
+          <w:sz w:val="24"/>
+          <w:szCs w:val="24"/>
+        </w:rPr>
+        <w:t xml:space="preserve">        </w:t>
+      </w:r>
+      <w:r>
+        <w:rPr>
+          <w:rFonts w:ascii="Arial" w:hAnsi="Arial" w:cs="Arial"/>
+          <w:noProof/>
+          <w:sz w:val="24"/>
+          <w:szCs w:val="24"/>
+        </w:rPr>
+        <w:t>▼</w:t>
+      </w:r>
+    </w:p>
+    <w:p>
+      <w:pPr>
+        <w:spacing w:after="0" w:line="240" w:lineRule="auto"/>
+        <w:rPr>
+          <w:noProof/>
+          <w:sz w:val="24"/>
+          <w:szCs w:val="24"/>
+        </w:rPr>
+      </w:pPr>
+      <w:r>
+        <w:rPr>
+          <w:noProof/>
+          <w:sz w:val="24"/>
+          <w:szCs w:val="24"/>
+        </w:rPr>
+        <w:t>Trend ForecastResult</w:t>
+      </w:r>
+    </w:p>
+    <w:p>
+      <w:pPr>
+        <w:spacing w:after="0" w:line="240" w:lineRule="auto"/>
+        <w:rPr>
+          <w:noProof/>
+          <w:sz w:val="24"/>
+          <w:szCs w:val="24"/>
+        </w:rPr>
+      </w:pPr>
+      <w:r>
+        <w:rPr>
+          <w:noProof/>
+          <w:sz w:val="24"/>
+          <w:szCs w:val="24"/>
+        </w:rPr>
+        <w:t xml:space="preserve">        </w:t>
+      </w:r>
+      <w:r>
+        <w:rPr>
+          <w:noProof/>
+          <w:sz w:val="24"/>
+          <w:szCs w:val="24"/>
+        </w:rPr>
+        <w:t xml:space="preserve"> </w:t>
+      </w:r>
+      <w:r>
+        <w:rPr>
+          <w:noProof/>
+          <w:sz w:val="24"/>
+          <w:szCs w:val="24"/>
+        </w:rPr>
+        <w:t>│</w:t>
+      </w:r>
+    </w:p>
+    <w:p>
+      <w:pPr>
+        <w:spacing w:after="0" w:line="240" w:lineRule="auto"/>
+        <w:rPr>
+          <w:noProof/>
+          <w:sz w:val="24"/>
+          <w:szCs w:val="24"/>
+        </w:rPr>
+      </w:pPr>
+      <w:r>
+        <w:rPr>
+          <w:noProof/>
+          <w:sz w:val="24"/>
+          <w:szCs w:val="24"/>
+        </w:rPr>
+        <w:t xml:space="preserve">        </w:t>
+      </w:r>
+      <w:r>
+        <w:rPr>
+          <w:rFonts w:ascii="MS Gothic" w:eastAsia="MS Gothic" w:hAnsi="MS Gothic" w:cs="MS Gothic" w:hint="eastAsia"/>
+          <w:noProof/>
+          <w:sz w:val="24"/>
+          <w:szCs w:val="24"/>
+        </w:rPr>
+        <w:t>├</w:t>
+      </w:r>
+      <w:r>
+        <w:rPr>
+          <w:rFonts w:ascii="Calibri" w:hAnsi="Calibri" w:cs="Calibri"/>
+          <w:noProof/>
+          <w:sz w:val="24"/>
+          <w:szCs w:val="24"/>
+        </w:rPr>
+        <w:t>─────────────┐</w:t>
+      </w:r>
+    </w:p>
+    <w:p>
+      <w:pPr>
+        <w:spacing w:after="0" w:line="240" w:lineRule="auto"/>
+        <w:rPr>
+          <w:noProof/>
+          <w:sz w:val="24"/>
+          <w:szCs w:val="24"/>
+        </w:rPr>
+      </w:pPr>
+      <w:r>
+        <w:rPr>
+          <w:noProof/>
+          <w:sz w:val="24"/>
+          <w:szCs w:val="24"/>
+        </w:rPr>
+        <w:t xml:space="preserve">        </w:t>
+      </w:r>
+      <w:r>
+        <w:rPr>
+          <w:rFonts w:ascii="Arial" w:hAnsi="Arial" w:cs="Arial"/>
+          <w:noProof/>
+          <w:sz w:val="24"/>
+          <w:szCs w:val="24"/>
+        </w:rPr>
+        <w:t>▼</w:t>
+      </w:r>
+      <w:r>
+        <w:rPr>
+          <w:noProof/>
+          <w:sz w:val="24"/>
+          <w:szCs w:val="24"/>
+        </w:rPr>
+        <w:t xml:space="preserve">             </w:t>
+      </w:r>
+      <w:r>
+        <w:rPr>
+          <w:noProof/>
+          <w:sz w:val="24"/>
+          <w:szCs w:val="24"/>
+        </w:rPr>
+        <w:t xml:space="preserve">                </w:t>
+      </w:r>
+      <w:r>
+        <w:rPr>
+          <w:rFonts w:ascii="Calibri" w:hAnsi="Calibri" w:cs="Calibri"/>
+          <w:noProof/>
+          <w:sz w:val="24"/>
+          <w:szCs w:val="24"/>
+        </w:rPr>
+        <w:t>│</w:t>
+      </w:r>
+    </w:p>
+    <w:p>
+      <w:pPr>
+        <w:spacing w:after="0" w:line="240" w:lineRule="auto"/>
+        <w:rPr>
+          <w:noProof/>
+          <w:sz w:val="24"/>
+          <w:szCs w:val="24"/>
+        </w:rPr>
+      </w:pPr>
+      <w:r>
+        <w:rPr>
+          <w:noProof/>
+          <w:sz w:val="24"/>
+          <w:szCs w:val="24"/>
+        </w:rPr>
+        <w:t xml:space="preserve">prepare_residuals()   </w:t>
+      </w:r>
+      <w:r>
+        <w:rPr>
+          <w:noProof/>
+          <w:sz w:val="24"/>
+          <w:szCs w:val="24"/>
+        </w:rPr>
+        <w:t xml:space="preserve">   </w:t>
+      </w:r>
+      <w:r>
+        <w:rPr>
+          <w:noProof/>
+          <w:sz w:val="24"/>
+          <w:szCs w:val="24"/>
+        </w:rPr>
+        <w:t>│</w:t>
+      </w:r>
+    </w:p>
+    <w:p>
+      <w:pPr>
+        <w:spacing w:after="0" w:line="240" w:lineRule="auto"/>
+        <w:rPr>
+          <w:noProof/>
+          <w:sz w:val="24"/>
+          <w:szCs w:val="24"/>
+        </w:rPr>
+      </w:pPr>
+      <w:r>
+        <w:rPr>
+          <w:noProof/>
+          <w:sz w:val="24"/>
+          <w:szCs w:val="24"/>
+        </w:rPr>
+        <w:t xml:space="preserve">        </w:t>
+      </w:r>
+      <w:r>
+        <w:rPr>
+          <w:rFonts w:ascii="Arial" w:hAnsi="Arial" w:cs="Arial"/>
+          <w:noProof/>
+          <w:sz w:val="24"/>
+          <w:szCs w:val="24"/>
+        </w:rPr>
+        <w:t>▼</w:t>
+      </w:r>
+      <w:r>
+        <w:rPr>
+          <w:noProof/>
+          <w:sz w:val="24"/>
+          <w:szCs w:val="24"/>
+        </w:rPr>
+        <w:t xml:space="preserve">             </w:t>
+      </w:r>
+      <w:r>
+        <w:rPr>
+          <w:noProof/>
+          <w:sz w:val="24"/>
+          <w:szCs w:val="24"/>
+        </w:rPr>
+        <w:t xml:space="preserve">                </w:t>
+      </w:r>
+      <w:r>
+        <w:rPr>
+          <w:rFonts w:ascii="Calibri" w:hAnsi="Calibri" w:cs="Calibri"/>
+          <w:noProof/>
+          <w:sz w:val="24"/>
+          <w:szCs w:val="24"/>
+        </w:rPr>
+        <w:t>│</w:t>
+      </w:r>
+    </w:p>
+    <w:p>
+      <w:pPr>
+        <w:spacing w:after="0" w:line="240" w:lineRule="auto"/>
+        <w:rPr>
+          <w:noProof/>
+          <w:sz w:val="24"/>
+          <w:szCs w:val="24"/>
+        </w:rPr>
+      </w:pPr>
+      <w:r>
+        <w:rPr>
+          <w:noProof/>
+          <w:sz w:val="24"/>
+          <w:szCs w:val="24"/>
+        </w:rPr>
+        <w:t xml:space="preserve">Residual Dataset      </w:t>
+      </w:r>
+      <w:r>
+        <w:rPr>
+          <w:noProof/>
+          <w:sz w:val="24"/>
+          <w:szCs w:val="24"/>
+        </w:rPr>
+        <w:t xml:space="preserve">     </w:t>
+      </w:r>
+      <w:r>
+        <w:rPr>
+          <w:noProof/>
+          <w:sz w:val="24"/>
+          <w:szCs w:val="24"/>
+        </w:rPr>
+        <w:t>│</w:t>
+      </w:r>
+    </w:p>
+    <w:p>
+      <w:pPr>
+        <w:spacing w:after="0" w:line="240" w:lineRule="auto"/>
+        <w:rPr>
+          <w:noProof/>
+          <w:sz w:val="24"/>
+          <w:szCs w:val="24"/>
+        </w:rPr>
+      </w:pPr>
+      <w:r>
+        <w:rPr>
+          <w:noProof/>
+          <w:sz w:val="24"/>
+          <w:szCs w:val="24"/>
+        </w:rPr>
+        <w:t xml:space="preserve">        </w:t>
+      </w:r>
+      <w:r>
+        <w:rPr>
+          <w:rFonts w:ascii="Arial" w:hAnsi="Arial" w:cs="Arial"/>
+          <w:noProof/>
+          <w:sz w:val="24"/>
+          <w:szCs w:val="24"/>
+        </w:rPr>
+        <w:t>▼</w:t>
+      </w:r>
+      <w:r>
+        <w:rPr>
+          <w:noProof/>
+          <w:sz w:val="24"/>
+          <w:szCs w:val="24"/>
+        </w:rPr>
+        <w:t xml:space="preserve">             </w:t>
+      </w:r>
+      <w:r>
+        <w:rPr>
+          <w:noProof/>
+          <w:sz w:val="24"/>
+          <w:szCs w:val="24"/>
+        </w:rPr>
+        <w:t xml:space="preserve">                </w:t>
+      </w:r>
+      <w:r>
+        <w:rPr>
+          <w:rFonts w:ascii="Calibri" w:hAnsi="Calibri" w:cs="Calibri"/>
+          <w:noProof/>
+          <w:sz w:val="24"/>
+          <w:szCs w:val="24"/>
+        </w:rPr>
+        <w:t>│</w:t>
+      </w:r>
+    </w:p>
+    <w:p>
+      <w:pPr>
+        <w:spacing w:after="0" w:line="240" w:lineRule="auto"/>
+        <w:rPr>
+          <w:noProof/>
+          <w:sz w:val="24"/>
+          <w:szCs w:val="24"/>
+        </w:rPr>
+      </w:pPr>
+      <w:r>
+        <w:rPr>
+          <w:noProof/>
+          <w:sz w:val="24"/>
+          <w:szCs w:val="24"/>
+        </w:rPr>
+        <w:t xml:space="preserve">Residual Model        </w:t>
+      </w:r>
+      <w:r>
+        <w:rPr>
+          <w:noProof/>
+          <w:sz w:val="24"/>
+          <w:szCs w:val="24"/>
+        </w:rPr>
+        <w:t xml:space="preserve">      </w:t>
+      </w:r>
+      <w:r>
+        <w:rPr>
+          <w:noProof/>
+          <w:sz w:val="24"/>
+          <w:szCs w:val="24"/>
+        </w:rPr>
+        <w:t>│</w:t>
+      </w:r>
+    </w:p>
+    <w:p>
+      <w:pPr>
+        <w:spacing w:after="0" w:line="240" w:lineRule="auto"/>
+        <w:rPr>
+          <w:noProof/>
+          <w:sz w:val="24"/>
+          <w:szCs w:val="24"/>
+        </w:rPr>
+      </w:pPr>
+      <w:r>
+        <w:rPr>
+          <w:noProof/>
+          <w:sz w:val="24"/>
+          <w:szCs w:val="24"/>
+        </w:rPr>
+        <w:t xml:space="preserve">        </w:t>
+      </w:r>
+      <w:r>
+        <w:rPr>
+          <w:rFonts w:ascii="Arial" w:hAnsi="Arial" w:cs="Arial"/>
+          <w:noProof/>
+          <w:sz w:val="24"/>
+          <w:szCs w:val="24"/>
+        </w:rPr>
+        <w:t>▼</w:t>
+      </w:r>
+      <w:r>
+        <w:rPr>
+          <w:noProof/>
+          <w:sz w:val="24"/>
+          <w:szCs w:val="24"/>
+        </w:rPr>
+        <w:t xml:space="preserve">             </w:t>
+      </w:r>
+      <w:r>
+        <w:rPr>
+          <w:noProof/>
+          <w:sz w:val="24"/>
+          <w:szCs w:val="24"/>
+        </w:rPr>
+        <w:t xml:space="preserve">                </w:t>
+      </w:r>
+      <w:r>
+        <w:rPr>
+          <w:rFonts w:ascii="Calibri" w:hAnsi="Calibri" w:cs="Calibri"/>
+          <w:noProof/>
+          <w:sz w:val="24"/>
+          <w:szCs w:val="24"/>
+        </w:rPr>
+        <w:t>│</w:t>
+      </w:r>
+    </w:p>
+    <w:p>
+      <w:pPr>
+        <w:spacing w:after="0" w:line="240" w:lineRule="auto"/>
+        <w:rPr>
+          <w:noProof/>
+          <w:sz w:val="24"/>
+          <w:szCs w:val="24"/>
+        </w:rPr>
+      </w:pPr>
+      <w:r>
+        <w:rPr>
+          <w:noProof/>
+          <w:sz w:val="24"/>
+          <w:szCs w:val="24"/>
+        </w:rPr>
+        <w:t>Residual ForecastResult</w:t>
+      </w:r>
+    </w:p>
+    <w:p>
+      <w:pPr>
+        <w:spacing w:after="0" w:line="240" w:lineRule="auto"/>
+        <w:rPr>
+          <w:noProof/>
+          <w:sz w:val="24"/>
+          <w:szCs w:val="24"/>
+        </w:rPr>
+      </w:pPr>
+      <w:r>
+        <w:rPr>
+          <w:noProof/>
+          <w:sz w:val="24"/>
+          <w:szCs w:val="24"/>
+        </w:rPr>
+        <w:t xml:space="preserve">        </w:t>
+      </w:r>
+      <w:r>
+        <w:rPr>
+          <w:noProof/>
+          <w:sz w:val="24"/>
+          <w:szCs w:val="24"/>
+        </w:rPr>
+        <w:t xml:space="preserve"> </w:t>
+      </w:r>
+      <w:r>
+        <w:rPr>
+          <w:noProof/>
+          <w:sz w:val="24"/>
+          <w:szCs w:val="24"/>
+        </w:rPr>
+        <w:t>│</w:t>
+      </w:r>
+    </w:p>
+    <w:p>
+      <w:pPr>
+        <w:spacing w:after="0" w:line="240" w:lineRule="auto"/>
+        <w:rPr>
+          <w:noProof/>
+          <w:sz w:val="24"/>
+          <w:szCs w:val="24"/>
+        </w:rPr>
+      </w:pPr>
+      <w:r>
+        <w:rPr>
+          <w:noProof/>
+          <w:sz w:val="24"/>
+          <w:szCs w:val="24"/>
+        </w:rPr>
+        <w:t xml:space="preserve">        </w:t>
+      </w:r>
+      <w:r>
+        <w:rPr>
+          <w:rFonts w:ascii="Arial" w:hAnsi="Arial" w:cs="Arial"/>
+          <w:noProof/>
+          <w:sz w:val="24"/>
+          <w:szCs w:val="24"/>
+        </w:rPr>
+        <w:t>▼</w:t>
+      </w:r>
+    </w:p>
+    <w:p>
+      <w:pPr>
+        <w:spacing w:after="0" w:line="240" w:lineRule="auto"/>
+        <w:rPr>
+          <w:noProof/>
+          <w:sz w:val="24"/>
+          <w:szCs w:val="24"/>
+        </w:rPr>
+      </w:pPr>
+      <w:r>
+        <w:rPr>
+          <w:noProof/>
+          <w:sz w:val="24"/>
+          <w:szCs w:val="24"/>
+        </w:rPr>
+        <w:t>combine_forecasts()</w:t>
+      </w:r>
+    </w:p>
+    <w:p>
+      <w:pPr>
+        <w:spacing w:after="0" w:line="240" w:lineRule="auto"/>
+        <w:rPr>
+          <w:noProof/>
+          <w:sz w:val="24"/>
+          <w:szCs w:val="24"/>
+        </w:rPr>
+      </w:pPr>
+      <w:r>
+        <w:rPr>
+          <w:noProof/>
+          <w:sz w:val="24"/>
+          <w:szCs w:val="24"/>
+        </w:rPr>
+        <w:t xml:space="preserve">        </w:t>
+      </w:r>
+      <w:r>
+        <w:rPr>
+          <w:noProof/>
+          <w:sz w:val="24"/>
+          <w:szCs w:val="24"/>
+        </w:rPr>
+        <w:t xml:space="preserve"> </w:t>
+      </w:r>
+      <w:r>
+        <w:rPr>
+          <w:noProof/>
+          <w:sz w:val="24"/>
+          <w:szCs w:val="24"/>
+        </w:rPr>
+        <w:t>│</w:t>
+      </w:r>
+    </w:p>
+    <w:p>
+      <w:pPr>
+        <w:spacing w:after="0" w:line="240" w:lineRule="auto"/>
+        <w:rPr>
+          <w:noProof/>
+          <w:sz w:val="24"/>
+          <w:szCs w:val="24"/>
+        </w:rPr>
+      </w:pPr>
+      <w:r>
+        <w:rPr>
+          <w:noProof/>
+          <w:sz w:val="24"/>
+          <w:szCs w:val="24"/>
+        </w:rPr>
+        <w:t xml:space="preserve">        </w:t>
+      </w:r>
+      <w:r>
+        <w:rPr>
+          <w:rFonts w:ascii="Arial" w:hAnsi="Arial" w:cs="Arial"/>
+          <w:noProof/>
+          <w:sz w:val="24"/>
+          <w:szCs w:val="24"/>
+        </w:rPr>
+        <w:t>▼</w:t>
+      </w:r>
+    </w:p>
+    <w:p>
+      <w:pPr>
+        <w:spacing w:after="0" w:line="240" w:lineRule="auto"/>
+        <w:rPr>
+          <w:noProof/>
+          <w:sz w:val="24"/>
+          <w:szCs w:val="24"/>
+        </w:rPr>
+      </w:pPr>
+      <w:r>
+        <w:rPr>
+          <w:noProof/>
+          <w:sz w:val="24"/>
+          <w:szCs w:val="24"/>
+        </w:rPr>
+        <w:t>Hybrid ForecastResult</w:t>
+      </w:r>
+    </w:p>
+    <w:p>
+      <w:pPr>
+        <w:spacing w:after="0" w:line="240" w:lineRule="auto"/>
+        <w:rPr>
+          <w:noProof/>
+          <w:sz w:val="24"/>
+          <w:szCs w:val="24"/>
+        </w:rPr>
+      </w:pPr>
     </w:p>
     <w:sectPr>
       <w:pgSz w:w="11906" w:h="16838"/>

</xml_diff>